<commit_message>
some changes in 3rd practise
</commit_message>
<xml_diff>
--- a/Практическая_3_Немчинова.docx
+++ b/Практическая_3_Немчинова.docx
@@ -7742,10 +7742,10 @@
           <w:rtl w:val="off"/>
         </w:rPr>
         <w:drawing>
-          <wp:inline distT="0" distB="0" distL="180" distR="180">
+          <wp:inline distT="0" distB="0" distL="0" distR="0">
             <wp:extent cx="5086704" cy="2301656"/>
             <wp:effectExtent l="0" t="0" r="0" b="0"/>
-            <wp:docPr id="1058" name="shape1058" hidden="0"/>
+            <wp:docPr id="1055" name="shape1055" hidden="0"/>
             <wp:cNvGraphicFramePr>
               <a:graphicFrameLocks xmlns:a="http://schemas.openxmlformats.org/drawingml/2006/main" noChangeAspect="1"/>
             </wp:cNvGraphicFramePr>
@@ -7937,7 +7937,7 @@
           <w:szCs w:val="28"/>
         </w:rPr>
         <w:drawing>
-          <wp:inline distT="0" distB="0" distL="180" distR="180">
+          <wp:inline distT="0" distB="0" distL="0" distR="0">
             <wp:extent cx="5657145" cy="333844"/>
             <wp:effectExtent l="0" t="0" r="0" b="0"/>
             <wp:docPr id="1056" name="shape1056" hidden="0"/>
@@ -8190,10 +8190,10 @@
           <w:szCs w:val="28"/>
         </w:rPr>
         <w:drawing>
-          <wp:inline distT="0" distB="0" distL="180" distR="180">
+          <wp:inline distT="0" distB="0" distL="0" distR="0">
             <wp:extent cx="5940425" cy="2311400"/>
             <wp:effectExtent l="0" t="0" r="0" b="0"/>
-            <wp:docPr id="1059" name="shape1059" hidden="0"/>
+            <wp:docPr id="1057" name="shape1057" hidden="0"/>
             <wp:cNvGraphicFramePr>
               <a:graphicFrameLocks xmlns:a="http://schemas.openxmlformats.org/drawingml/2006/main" noChangeAspect="1"/>
             </wp:cNvGraphicFramePr>
@@ -8377,10 +8377,10 @@
           <w:rtl w:val="off"/>
         </w:rPr>
         <w:drawing>
-          <wp:inline distT="0" distB="0" distL="180" distR="180">
+          <wp:inline distT="0" distB="0" distL="0" distR="0">
             <wp:extent cx="3644900" cy="215900"/>
             <wp:effectExtent l="0" t="0" r="0" b="0"/>
-            <wp:docPr id="1061" name="shape1061" hidden="0"/>
+            <wp:docPr id="1058" name="shape1058" hidden="0"/>
             <wp:cNvGraphicFramePr>
               <a:graphicFrameLocks xmlns:a="http://schemas.openxmlformats.org/drawingml/2006/main" noChangeAspect="1"/>
             </wp:cNvGraphicFramePr>
@@ -8600,10 +8600,10 @@
           <w:rtl w:val="off"/>
         </w:rPr>
         <w:drawing>
-          <wp:inline distT="0" distB="0" distL="180" distR="180">
+          <wp:inline distT="0" distB="0" distL="0" distR="0">
             <wp:extent cx="5940425" cy="5145405"/>
             <wp:effectExtent l="0" t="0" r="0" b="0"/>
-            <wp:docPr id="1060" name="shape1060" hidden="0"/>
+            <wp:docPr id="1059" name="shape1059" hidden="0"/>
             <wp:cNvGraphicFramePr>
               <a:graphicFrameLocks xmlns:a="http://schemas.openxmlformats.org/drawingml/2006/main" noChangeAspect="1"/>
             </wp:cNvGraphicFramePr>
@@ -8775,10 +8775,10 @@
           <w:szCs w:val="28"/>
         </w:rPr>
         <w:drawing>
-          <wp:inline distT="0" distB="0" distL="180" distR="180">
+          <wp:inline distT="0" distB="0" distL="0" distR="0">
             <wp:extent cx="3378200" cy="311150"/>
             <wp:effectExtent l="0" t="0" r="0" b="0"/>
-            <wp:docPr id="1062" name="shape1062" hidden="0"/>
+            <wp:docPr id="1060" name="shape1060" hidden="0"/>
             <wp:cNvGraphicFramePr>
               <a:graphicFrameLocks xmlns:a="http://schemas.openxmlformats.org/drawingml/2006/main" noChangeAspect="1"/>
             </wp:cNvGraphicFramePr>
@@ -8916,10 +8916,10 @@
           <w:szCs w:val="28"/>
         </w:rPr>
         <w:drawing>
-          <wp:inline distT="0" distB="0" distL="180" distR="180">
+          <wp:inline distT="0" distB="0" distL="0" distR="0">
             <wp:extent cx="4508500" cy="349250"/>
             <wp:effectExtent l="0" t="0" r="0" b="0"/>
-            <wp:docPr id="1063" name="shape1063" hidden="0"/>
+            <wp:docPr id="1061" name="shape1061" hidden="0"/>
             <wp:cNvGraphicFramePr>
               <a:graphicFrameLocks xmlns:a="http://schemas.openxmlformats.org/drawingml/2006/main" noChangeAspect="1"/>
             </wp:cNvGraphicFramePr>
@@ -8996,6 +8996,108 @@
     <w:p>
       <w:pPr>
         <w:ind w:firstLine="708"/>
+        <w:jc w:val="both"/>
+        <w:spacing w:line="360"/>
+        <w:rPr>
+          <w:lang w:val="ru-RU"/>
+          <w:rFonts w:ascii="Times New Roman" w:eastAsia="Times New Roman" w:hAnsi="Times New Roman"/>
+          <w:sz w:val="28"/>
+          <w:szCs w:val="28"/>
+          <w:rtl w:val="off"/>
+        </w:rPr>
+      </w:pPr>
+      <w:r>
+        <w:rPr>
+          <w:lang w:val="ru-RU"/>
+          <w:rFonts w:ascii="Times New Roman" w:eastAsia="Times New Roman" w:hAnsi="Times New Roman" w:hint="default"/>
+          <w:sz w:val="28"/>
+          <w:szCs w:val="28"/>
+          <w:rtl w:val="off"/>
+        </w:rPr>
+        <w:t xml:space="preserve">6. Восстановление данных при ошибках </w:t>
+      </w:r>
+      <w:r>
+        <w:rPr>
+          <w:lang w:val="en-US"/>
+          <w:rFonts w:ascii="Times New Roman" w:eastAsia="Times New Roman" w:hAnsi="Times New Roman" w:hint="default"/>
+          <w:sz w:val="28"/>
+          <w:szCs w:val="28"/>
+          <w:rtl w:val="off"/>
+        </w:rPr>
+        <w:t>RAID1</w:t>
+      </w:r>
+    </w:p>
+    <w:p>
+      <w:pPr>
+        <w:ind w:firstLine="708"/>
+        <w:jc w:val="both"/>
+        <w:spacing w:line="360"/>
+        <w:rPr>
+          <w:lang w:val="ru-RU"/>
+          <w:rFonts w:ascii="Times New Roman" w:eastAsia="Times New Roman" w:hAnsi="Times New Roman"/>
+          <w:sz w:val="28"/>
+          <w:szCs w:val="28"/>
+          <w:rtl w:val="off"/>
+        </w:rPr>
+      </w:pPr>
+      <w:r>
+        <w:rPr>
+          <w:lang w:val="ru-RU"/>
+          <w:rFonts w:ascii="Times New Roman" w:eastAsia="Times New Roman" w:hAnsi="Times New Roman" w:hint="default"/>
+          <w:sz w:val="28"/>
+          <w:szCs w:val="28"/>
+          <w:rtl w:val="off"/>
+        </w:rPr>
+        <w:t>6.1. Создание файла с данными.</w:t>
+      </w:r>
+    </w:p>
+    <w:p>
+      <w:pPr>
+        <w:ind w:firstLine="708"/>
+        <w:jc w:val="both"/>
+        <w:spacing w:line="360"/>
+        <w:rPr>
+          <w:lang w:val="ru-RU"/>
+          <w:rFonts w:ascii="Times New Roman" w:eastAsia="Times New Roman" w:hAnsi="Times New Roman"/>
+          <w:sz w:val="28"/>
+          <w:szCs w:val="28"/>
+          <w:rtl w:val="off"/>
+        </w:rPr>
+      </w:pPr>
+      <w:r>
+        <w:rPr>
+          <w:lang w:val="ru-RU"/>
+          <w:rFonts w:ascii="Times New Roman" w:eastAsia="Times New Roman" w:hAnsi="Times New Roman" w:hint="default"/>
+          <w:sz w:val="28"/>
+          <w:szCs w:val="28"/>
+          <w:rtl w:val="off"/>
+        </w:rPr>
+        <w:t xml:space="preserve">Для того, чтобы научиться тестировать </w:t>
+      </w:r>
+      <w:r>
+        <w:rPr>
+          <w:lang w:val="en-US"/>
+          <w:rFonts w:ascii="Times New Roman" w:eastAsia="Times New Roman" w:hAnsi="Times New Roman" w:hint="default"/>
+          <w:sz w:val="28"/>
+          <w:szCs w:val="28"/>
+          <w:rtl w:val="off"/>
+        </w:rPr>
+        <w:t>LVM RAID1</w:t>
+      </w:r>
+      <w:r>
+        <w:rPr>
+          <w:lang w:val="ru-RU"/>
+          <w:rFonts w:ascii="Times New Roman" w:eastAsia="Times New Roman" w:hAnsi="Times New Roman" w:hint="default"/>
+          <w:sz w:val="28"/>
+          <w:szCs w:val="28"/>
+          <w:rtl w:val="off"/>
+        </w:rPr>
+        <w:t>, я создала большой файл с данными командой, описанной на рис. 38.</w:t>
+      </w:r>
+    </w:p>
+    <w:p>
+      <w:pPr>
+        <w:ind w:firstLine="708"/>
         <w:jc w:val="center"/>
         <w:spacing w:line="360"/>
         <w:rPr>
@@ -9006,6 +9108,91 @@
           <w:rtl w:val="off"/>
         </w:rPr>
       </w:pPr>
+      <w:r>
+        <w:rPr>
+          <w:lang w:val="ru-RU"/>
+          <w:rFonts w:ascii="Times New Roman" w:eastAsia="Times New Roman" w:hAnsi="Times New Roman"/>
+          <w:sz w:val="28"/>
+          <w:szCs w:val="28"/>
+          <w:rtl w:val="off"/>
+        </w:rPr>
+        <w:drawing>
+          <wp:inline distT="0" distB="0" distL="180" distR="180">
+            <wp:extent cx="4457700" cy="692150"/>
+            <wp:effectExtent l="0" t="0" r="0" b="0"/>
+            <wp:docPr id="1062" name="shape1062" hidden="0"/>
+            <wp:cNvGraphicFramePr>
+              <a:graphicFrameLocks xmlns:a="http://schemas.openxmlformats.org/drawingml/2006/main" noChangeAspect="1"/>
+            </wp:cNvGraphicFramePr>
+            <a:graphic xmlns:a="http://schemas.openxmlformats.org/drawingml/2006/main">
+              <a:graphicData uri="http://schemas.openxmlformats.org/drawingml/2006/picture">
+                <pic:pic xmlns:pic="http://schemas.openxmlformats.org/drawingml/2006/picture">
+                  <pic:nvPicPr>
+                    <pic:cNvPr id="0" name="이미지"/>
+                    <pic:cNvPicPr preferRelativeResize="1">
+                      <a:picLocks noChangeAspect="1"/>
+                    </pic:cNvPicPr>
+                  </pic:nvPicPr>
+                  <pic:blipFill>
+                    <a:blip r:embed="rId38">
+                      <a:extLst>
+                        <a:ext uri="{28A0092B-C50C-407E-A947-70E740481C1C}">
+                          <a14:useLocalDpi xmlns:a14="http://schemas.microsoft.com/office/drawing/2010/main" val="0"/>
+                        </a:ext>
+                      </a:extLst>
+                    </a:blip>
+                    <a:srcRect/>
+                    <a:stretch>
+                      <a:fillRect/>
+                    </a:stretch>
+                  </pic:blipFill>
+                  <pic:spPr>
+                    <a:xfrm>
+                      <a:off x="0" y="0"/>
+                      <a:ext cx="4457700" cy="692150"/>
+                    </a:xfrm>
+                    <a:prstGeom prst="rect"/>
+                  </pic:spPr>
+                </pic:pic>
+              </a:graphicData>
+            </a:graphic>
+          </wp:inline>
+        </w:drawing>
+      </w:r>
+    </w:p>
+    <w:p>
+      <w:pPr>
+        <w:ind w:firstLine="708"/>
+        <w:jc w:val="center"/>
+        <w:spacing w:line="360"/>
+        <w:rPr>
+          <w:lang w:val="ru-RU"/>
+          <w:rFonts w:ascii="Times New Roman" w:eastAsia="Times New Roman" w:hAnsi="Times New Roman"/>
+          <w:sz w:val="28"/>
+          <w:szCs w:val="28"/>
+          <w:rtl w:val="off"/>
+        </w:rPr>
+      </w:pPr>
+      <w:r>
+        <w:rPr>
+          <w:lang w:val="ru-RU"/>
+          <w:rFonts w:ascii="Times New Roman" w:eastAsia="Times New Roman" w:hAnsi="Times New Roman"/>
+          <w:sz w:val="28"/>
+          <w:szCs w:val="28"/>
+          <w:rtl w:val="off"/>
+        </w:rPr>
+        <w:t xml:space="preserve">Рисунок 38 </w:t>
+      </w:r>
+      <w:r>
+        <w:rPr>
+          <w:lang w:val="ru-RU"/>
+          <w:rFonts w:ascii="Times New Roman" w:eastAsia="Times New Roman" w:hAnsi="Times New Roman" w:hint="default"/>
+          <w:sz w:val="28"/>
+          <w:szCs w:val="28"/>
+          <w:rtl w:val="off"/>
+        </w:rPr>
+        <w:t>‒ Создание файла</w:t>
+      </w:r>
     </w:p>
     <w:p>
       <w:pPr>
@@ -9013,30 +9200,1089 @@
         <w:jc w:val="both"/>
         <w:spacing w:line="360"/>
         <w:rPr>
-          <w:rFonts w:ascii="Times New Roman" w:eastAsia="Times New Roman" w:hAnsi="Times New Roman" w:hint="default"/>
-          <w:sz w:val="28"/>
-          <w:szCs w:val="28"/>
-        </w:rPr>
-      </w:pPr>
-      <w:r>
-        <w:rPr>
-          <w:lang w:val="ru-RU"/>
-          <w:rFonts w:ascii="Times New Roman" w:eastAsia="Times New Roman" w:hAnsi="Times New Roman" w:hint="default"/>
-          <w:sz w:val="28"/>
-          <w:szCs w:val="28"/>
-          <w:rtl w:val="off"/>
-        </w:rPr>
-        <w:t xml:space="preserve">6. Восстановление данных при ошибках </w:t>
-      </w:r>
-      <w:r>
-        <w:rPr>
-          <w:lang w:val="en-US"/>
-          <w:rFonts w:ascii="Times New Roman" w:eastAsia="Times New Roman" w:hAnsi="Times New Roman" w:hint="default"/>
-          <w:sz w:val="28"/>
-          <w:szCs w:val="28"/>
-          <w:rtl w:val="off"/>
-        </w:rPr>
-        <w:t>RAID1</w:t>
+          <w:lang w:val="ru-RU"/>
+          <w:rFonts w:ascii="Times New Roman" w:eastAsia="Times New Roman" w:hAnsi="Times New Roman"/>
+          <w:sz w:val="28"/>
+          <w:szCs w:val="28"/>
+          <w:rtl w:val="off"/>
+        </w:rPr>
+      </w:pPr>
+      <w:r>
+        <w:rPr>
+          <w:lang w:val="ru-RU"/>
+          <w:rFonts w:ascii="Times New Roman" w:eastAsia="Times New Roman" w:hAnsi="Times New Roman"/>
+          <w:sz w:val="28"/>
+          <w:szCs w:val="28"/>
+          <w:rtl w:val="off"/>
+        </w:rPr>
+        <w:t xml:space="preserve">Размер файла </w:t>
+      </w:r>
+      <w:r>
+        <w:rPr>
+          <w:lang w:val="ru-RU"/>
+          <w:rFonts w:ascii="Times New Roman" w:eastAsia="Times New Roman" w:hAnsi="Times New Roman" w:hint="default"/>
+          <w:sz w:val="28"/>
+          <w:szCs w:val="28"/>
+          <w:rtl w:val="off"/>
+        </w:rPr>
+        <w:t>‒ 22 МБ (рис.39).</w:t>
+      </w:r>
+    </w:p>
+    <w:p>
+      <w:pPr>
+        <w:ind w:firstLine="708"/>
+        <w:jc w:val="center"/>
+        <w:spacing w:line="360"/>
+        <w:rPr>
+          <w:lang w:val="ru-RU"/>
+          <w:rFonts w:ascii="Times New Roman" w:eastAsia="Times New Roman" w:hAnsi="Times New Roman"/>
+          <w:sz w:val="28"/>
+          <w:szCs w:val="28"/>
+          <w:rtl w:val="off"/>
+        </w:rPr>
+      </w:pPr>
+      <w:r>
+        <w:rPr>
+          <w:lang w:val="ru-RU"/>
+          <w:rFonts w:ascii="Times New Roman" w:eastAsia="Times New Roman" w:hAnsi="Times New Roman"/>
+          <w:sz w:val="28"/>
+          <w:szCs w:val="28"/>
+          <w:rtl w:val="off"/>
+        </w:rPr>
+        <w:drawing>
+          <wp:inline distT="0" distB="0" distL="180" distR="180">
+            <wp:extent cx="5940425" cy="515620"/>
+            <wp:effectExtent l="0" t="0" r="0" b="0"/>
+            <wp:docPr id="1063" name="shape1063" hidden="0"/>
+            <wp:cNvGraphicFramePr>
+              <a:graphicFrameLocks xmlns:a="http://schemas.openxmlformats.org/drawingml/2006/main" noChangeAspect="1"/>
+            </wp:cNvGraphicFramePr>
+            <a:graphic xmlns:a="http://schemas.openxmlformats.org/drawingml/2006/main">
+              <a:graphicData uri="http://schemas.openxmlformats.org/drawingml/2006/picture">
+                <pic:pic xmlns:pic="http://schemas.openxmlformats.org/drawingml/2006/picture">
+                  <pic:nvPicPr>
+                    <pic:cNvPr id="0" name="이미지"/>
+                    <pic:cNvPicPr preferRelativeResize="1">
+                      <a:picLocks noChangeAspect="1"/>
+                    </pic:cNvPicPr>
+                  </pic:nvPicPr>
+                  <pic:blipFill>
+                    <a:blip r:embed="rId39">
+                      <a:extLst>
+                        <a:ext uri="{28A0092B-C50C-407E-A947-70E740481C1C}">
+                          <a14:useLocalDpi xmlns:a14="http://schemas.microsoft.com/office/drawing/2010/main" val="0"/>
+                        </a:ext>
+                      </a:extLst>
+                    </a:blip>
+                    <a:srcRect/>
+                    <a:stretch>
+                      <a:fillRect/>
+                    </a:stretch>
+                  </pic:blipFill>
+                  <pic:spPr>
+                    <a:xfrm>
+                      <a:off x="0" y="0"/>
+                      <a:ext cx="5940425" cy="515620"/>
+                    </a:xfrm>
+                    <a:prstGeom prst="rect"/>
+                  </pic:spPr>
+                </pic:pic>
+              </a:graphicData>
+            </a:graphic>
+          </wp:inline>
+        </w:drawing>
+      </w:r>
+    </w:p>
+    <w:p>
+      <w:pPr>
+        <w:ind w:firstLine="708"/>
+        <w:jc w:val="center"/>
+        <w:spacing w:line="360"/>
+        <w:rPr>
+          <w:lang w:val="ru-RU"/>
+          <w:rFonts w:ascii="Times New Roman" w:eastAsia="Times New Roman" w:hAnsi="Times New Roman"/>
+          <w:sz w:val="28"/>
+          <w:szCs w:val="28"/>
+          <w:rtl w:val="off"/>
+        </w:rPr>
+      </w:pPr>
+      <w:r>
+        <w:rPr>
+          <w:lang w:val="ru-RU"/>
+          <w:rFonts w:ascii="Times New Roman" w:eastAsia="Times New Roman" w:hAnsi="Times New Roman"/>
+          <w:sz w:val="28"/>
+          <w:szCs w:val="28"/>
+          <w:rtl w:val="off"/>
+        </w:rPr>
+        <w:t xml:space="preserve">Рисунок 39 </w:t>
+      </w:r>
+      <w:r>
+        <w:rPr>
+          <w:lang w:val="ru-RU"/>
+          <w:rFonts w:ascii="Times New Roman" w:eastAsia="Times New Roman" w:hAnsi="Times New Roman" w:hint="default"/>
+          <w:sz w:val="28"/>
+          <w:szCs w:val="28"/>
+          <w:rtl w:val="off"/>
+        </w:rPr>
+        <w:t>‒ Информация о файле</w:t>
+      </w:r>
+    </w:p>
+    <w:p>
+      <w:pPr>
+        <w:ind w:firstLine="708"/>
+        <w:jc w:val="both"/>
+        <w:spacing w:line="360"/>
+        <w:rPr>
+          <w:lang w:val="ru-RU"/>
+          <w:rFonts w:ascii="Times New Roman" w:eastAsia="Times New Roman" w:hAnsi="Times New Roman"/>
+          <w:sz w:val="28"/>
+          <w:szCs w:val="28"/>
+          <w:rtl w:val="off"/>
+        </w:rPr>
+      </w:pPr>
+      <w:r>
+        <w:rPr>
+          <w:lang w:val="ru-RU"/>
+          <w:rFonts w:ascii="Times New Roman" w:eastAsia="Times New Roman" w:hAnsi="Times New Roman"/>
+          <w:sz w:val="28"/>
+          <w:szCs w:val="28"/>
+          <w:rtl w:val="off"/>
+        </w:rPr>
+        <w:t>6.2. Проверка состояния тома.</w:t>
+      </w:r>
+    </w:p>
+    <w:p>
+      <w:pPr>
+        <w:ind w:firstLine="708"/>
+        <w:jc w:val="both"/>
+        <w:spacing w:line="360"/>
+        <w:rPr>
+          <w:lang w:val="ru-RU"/>
+          <w:rFonts w:ascii="Times New Roman" w:eastAsia="Times New Roman" w:hAnsi="Times New Roman"/>
+          <w:sz w:val="28"/>
+          <w:szCs w:val="28"/>
+          <w:rtl w:val="off"/>
+        </w:rPr>
+      </w:pPr>
+      <w:r>
+        <w:rPr>
+          <w:lang w:val="ru-RU"/>
+          <w:rFonts w:ascii="Times New Roman" w:eastAsia="Times New Roman" w:hAnsi="Times New Roman"/>
+          <w:sz w:val="28"/>
+          <w:szCs w:val="28"/>
+          <w:rtl w:val="off"/>
+        </w:rPr>
+        <w:t>Перед эмуляцией потери диска я проверила состояние тома (рис.40).</w:t>
+      </w:r>
+    </w:p>
+    <w:p>
+      <w:pPr>
+        <w:ind w:firstLine="708"/>
+        <w:jc w:val="center"/>
+        <w:spacing w:line="360"/>
+        <w:rPr>
+          <w:lang w:val="ru-RU"/>
+          <w:rFonts w:ascii="Times New Roman" w:eastAsia="Times New Roman" w:hAnsi="Times New Roman"/>
+          <w:sz w:val="28"/>
+          <w:szCs w:val="28"/>
+          <w:rtl w:val="off"/>
+        </w:rPr>
+      </w:pPr>
+      <w:r>
+        <w:rPr>
+          <w:lang w:val="ru-RU"/>
+          <w:rFonts w:ascii="Times New Roman" w:eastAsia="Times New Roman" w:hAnsi="Times New Roman"/>
+          <w:sz w:val="28"/>
+          <w:szCs w:val="28"/>
+          <w:rtl w:val="off"/>
+        </w:rPr>
+        <w:drawing>
+          <wp:inline distT="0" distB="0" distL="180" distR="180">
+            <wp:extent cx="5940425" cy="888365"/>
+            <wp:effectExtent l="0" t="0" r="0" b="0"/>
+            <wp:docPr id="1064" name="shape1064" hidden="0"/>
+            <wp:cNvGraphicFramePr>
+              <a:graphicFrameLocks xmlns:a="http://schemas.openxmlformats.org/drawingml/2006/main" noChangeAspect="1"/>
+            </wp:cNvGraphicFramePr>
+            <a:graphic xmlns:a="http://schemas.openxmlformats.org/drawingml/2006/main">
+              <a:graphicData uri="http://schemas.openxmlformats.org/drawingml/2006/picture">
+                <pic:pic xmlns:pic="http://schemas.openxmlformats.org/drawingml/2006/picture">
+                  <pic:nvPicPr>
+                    <pic:cNvPr id="0" name="이미지"/>
+                    <pic:cNvPicPr preferRelativeResize="1">
+                      <a:picLocks noChangeAspect="1"/>
+                    </pic:cNvPicPr>
+                  </pic:nvPicPr>
+                  <pic:blipFill>
+                    <a:blip r:embed="rId40">
+                      <a:extLst>
+                        <a:ext uri="{28A0092B-C50C-407E-A947-70E740481C1C}">
+                          <a14:useLocalDpi xmlns:a14="http://schemas.microsoft.com/office/drawing/2010/main" val="0"/>
+                        </a:ext>
+                      </a:extLst>
+                    </a:blip>
+                    <a:srcRect/>
+                    <a:stretch>
+                      <a:fillRect/>
+                    </a:stretch>
+                  </pic:blipFill>
+                  <pic:spPr>
+                    <a:xfrm>
+                      <a:off x="0" y="0"/>
+                      <a:ext cx="5940425" cy="888365"/>
+                    </a:xfrm>
+                    <a:prstGeom prst="rect"/>
+                  </pic:spPr>
+                </pic:pic>
+              </a:graphicData>
+            </a:graphic>
+          </wp:inline>
+        </w:drawing>
+      </w:r>
+    </w:p>
+    <w:p>
+      <w:pPr>
+        <w:ind w:firstLine="708"/>
+        <w:jc w:val="center"/>
+        <w:spacing w:line="360"/>
+        <w:rPr>
+          <w:lang w:val="ru-RU"/>
+          <w:rFonts w:ascii="Times New Roman" w:eastAsia="Times New Roman" w:hAnsi="Times New Roman"/>
+          <w:sz w:val="28"/>
+          <w:szCs w:val="28"/>
+          <w:rtl w:val="off"/>
+        </w:rPr>
+      </w:pPr>
+      <w:r>
+        <w:rPr>
+          <w:lang w:val="ru-RU"/>
+          <w:rFonts w:ascii="Times New Roman" w:eastAsia="Times New Roman" w:hAnsi="Times New Roman"/>
+          <w:sz w:val="28"/>
+          <w:szCs w:val="28"/>
+          <w:rtl w:val="off"/>
+        </w:rPr>
+        <w:t xml:space="preserve">Рисунок 40 </w:t>
+      </w:r>
+      <w:r>
+        <w:rPr>
+          <w:lang w:val="ru-RU"/>
+          <w:rFonts w:ascii="Times New Roman" w:eastAsia="Times New Roman" w:hAnsi="Times New Roman" w:hint="default"/>
+          <w:sz w:val="28"/>
+          <w:szCs w:val="28"/>
+          <w:rtl w:val="off"/>
+        </w:rPr>
+        <w:t>‒ Состояние логического тома</w:t>
+      </w:r>
+    </w:p>
+    <w:p>
+      <w:pPr>
+        <w:ind w:firstLine="708"/>
+        <w:jc w:val="both"/>
+        <w:spacing w:line="360"/>
+        <w:rPr>
+          <w:lang w:val="ru-RU"/>
+          <w:rFonts w:ascii="Times New Roman" w:eastAsia="Times New Roman" w:hAnsi="Times New Roman"/>
+          <w:sz w:val="28"/>
+          <w:szCs w:val="28"/>
+          <w:rtl w:val="off"/>
+        </w:rPr>
+      </w:pPr>
+      <w:r>
+        <w:rPr>
+          <w:lang w:val="ru-RU"/>
+          <w:rFonts w:ascii="Times New Roman" w:eastAsia="Times New Roman" w:hAnsi="Times New Roman"/>
+          <w:sz w:val="28"/>
+          <w:szCs w:val="28"/>
+          <w:rtl w:val="off"/>
+        </w:rPr>
+        <w:br w:type="page"/>
+      </w:r>
+    </w:p>
+    <w:p>
+      <w:pPr>
+        <w:ind w:firstLine="708"/>
+        <w:jc w:val="both"/>
+        <w:spacing w:line="360"/>
+        <w:rPr>
+          <w:lang w:val="ru-RU"/>
+          <w:rFonts w:ascii="Times New Roman" w:eastAsia="Times New Roman" w:hAnsi="Times New Roman"/>
+          <w:sz w:val="28"/>
+          <w:szCs w:val="28"/>
+          <w:rtl w:val="off"/>
+        </w:rPr>
+      </w:pPr>
+      <w:r>
+        <w:rPr>
+          <w:lang w:val="ru-RU"/>
+          <w:rFonts w:ascii="Times New Roman" w:eastAsia="Times New Roman" w:hAnsi="Times New Roman"/>
+          <w:sz w:val="28"/>
+          <w:szCs w:val="28"/>
+          <w:rtl w:val="off"/>
+        </w:rPr>
+        <w:t>6.3. Имитация потери диска.</w:t>
+      </w:r>
+    </w:p>
+    <w:p>
+      <w:pPr>
+        <w:ind w:firstLine="708"/>
+        <w:jc w:val="both"/>
+        <w:spacing w:line="360"/>
+        <w:rPr>
+          <w:lang w:val="ru-RU"/>
+          <w:rFonts w:ascii="Times New Roman" w:eastAsia="Times New Roman" w:hAnsi="Times New Roman"/>
+          <w:sz w:val="28"/>
+          <w:szCs w:val="28"/>
+          <w:rtl w:val="off"/>
+        </w:rPr>
+      </w:pPr>
+      <w:r>
+        <w:rPr>
+          <w:lang w:val="ru-RU"/>
+          <w:rFonts w:ascii="Times New Roman" w:eastAsia="Times New Roman" w:hAnsi="Times New Roman"/>
+          <w:sz w:val="28"/>
+          <w:szCs w:val="28"/>
+          <w:rtl w:val="off"/>
+        </w:rPr>
+        <w:t xml:space="preserve">Командами ls -l /sys/block/sdc и ls -l /sys/bus/scsi/devices/2:0:0:0 я убедилась в том, что путь /sys/block/sdc является символической ссылкой на подключенное </w:t>
+      </w:r>
+      <w:r>
+        <w:rPr>
+          <w:lang w:val="en-US"/>
+          <w:rFonts w:ascii="Times New Roman" w:eastAsia="Times New Roman" w:hAnsi="Times New Roman"/>
+          <w:sz w:val="28"/>
+          <w:szCs w:val="28"/>
+          <w:rtl w:val="off"/>
+        </w:rPr>
+        <w:t>SATA</w:t>
+      </w:r>
+      <w:r>
+        <w:rPr>
+          <w:lang w:val="ru-RU"/>
+          <w:rFonts w:ascii="Times New Roman" w:eastAsia="Times New Roman" w:hAnsi="Times New Roman"/>
+          <w:sz w:val="28"/>
+          <w:szCs w:val="28"/>
+          <w:rtl w:val="off"/>
+        </w:rPr>
+        <w:t xml:space="preserve"> устройство (рис.41).</w:t>
+      </w:r>
+    </w:p>
+    <w:p>
+      <w:pPr>
+        <w:ind w:firstLine="708"/>
+        <w:jc w:val="center"/>
+        <w:spacing w:line="360"/>
+        <w:rPr>
+          <w:lang w:val="ru-RU"/>
+          <w:rFonts w:ascii="Times New Roman" w:eastAsia="Times New Roman" w:hAnsi="Times New Roman"/>
+          <w:sz w:val="28"/>
+          <w:szCs w:val="28"/>
+          <w:rtl w:val="off"/>
+        </w:rPr>
+      </w:pPr>
+      <w:r>
+        <w:rPr>
+          <w:lang w:val="ru-RU"/>
+          <w:rFonts w:ascii="Times New Roman" w:eastAsia="Times New Roman" w:hAnsi="Times New Roman"/>
+          <w:sz w:val="28"/>
+          <w:szCs w:val="28"/>
+          <w:rtl w:val="off"/>
+        </w:rPr>
+        <w:drawing>
+          <wp:inline distT="0" distB="0" distL="180" distR="180">
+            <wp:extent cx="5940425" cy="374015"/>
+            <wp:effectExtent l="0" t="0" r="0" b="0"/>
+            <wp:docPr id="1065" name="shape1065" hidden="0"/>
+            <wp:cNvGraphicFramePr>
+              <a:graphicFrameLocks xmlns:a="http://schemas.openxmlformats.org/drawingml/2006/main" noChangeAspect="1"/>
+            </wp:cNvGraphicFramePr>
+            <a:graphic xmlns:a="http://schemas.openxmlformats.org/drawingml/2006/main">
+              <a:graphicData uri="http://schemas.openxmlformats.org/drawingml/2006/picture">
+                <pic:pic xmlns:pic="http://schemas.openxmlformats.org/drawingml/2006/picture">
+                  <pic:nvPicPr>
+                    <pic:cNvPr id="0" name="이미지"/>
+                    <pic:cNvPicPr preferRelativeResize="1">
+                      <a:picLocks noChangeAspect="1"/>
+                    </pic:cNvPicPr>
+                  </pic:nvPicPr>
+                  <pic:blipFill>
+                    <a:blip r:embed="rId41">
+                      <a:extLst>
+                        <a:ext uri="{28A0092B-C50C-407E-A947-70E740481C1C}">
+                          <a14:useLocalDpi xmlns:a14="http://schemas.microsoft.com/office/drawing/2010/main" val="0"/>
+                        </a:ext>
+                      </a:extLst>
+                    </a:blip>
+                    <a:srcRect/>
+                    <a:stretch>
+                      <a:fillRect/>
+                    </a:stretch>
+                  </pic:blipFill>
+                  <pic:spPr>
+                    <a:xfrm>
+                      <a:off x="0" y="0"/>
+                      <a:ext cx="5940425" cy="374015"/>
+                    </a:xfrm>
+                    <a:prstGeom prst="rect"/>
+                  </pic:spPr>
+                </pic:pic>
+              </a:graphicData>
+            </a:graphic>
+          </wp:inline>
+        </w:drawing>
+      </w:r>
+    </w:p>
+    <w:p>
+      <w:pPr>
+        <w:ind w:firstLine="708"/>
+        <w:jc w:val="center"/>
+        <w:spacing w:line="360"/>
+        <w:rPr>
+          <w:lang w:val="ru-RU"/>
+          <w:rFonts w:ascii="Times New Roman" w:eastAsia="Times New Roman" w:hAnsi="Times New Roman"/>
+          <w:sz w:val="28"/>
+          <w:szCs w:val="28"/>
+          <w:rtl w:val="off"/>
+        </w:rPr>
+      </w:pPr>
+      <w:r>
+        <w:rPr>
+          <w:lang w:val="ru-RU"/>
+          <w:rFonts w:ascii="Times New Roman" w:eastAsia="Times New Roman" w:hAnsi="Times New Roman"/>
+          <w:sz w:val="28"/>
+          <w:szCs w:val="28"/>
+          <w:rtl w:val="off"/>
+        </w:rPr>
+        <w:t xml:space="preserve">Рисунок 41 </w:t>
+      </w:r>
+      <w:r>
+        <w:rPr>
+          <w:lang w:val="ru-RU"/>
+          <w:rFonts w:ascii="Times New Roman" w:eastAsia="Times New Roman" w:hAnsi="Times New Roman" w:hint="default"/>
+          <w:sz w:val="28"/>
+          <w:szCs w:val="28"/>
+          <w:rtl w:val="off"/>
+        </w:rPr>
+        <w:t xml:space="preserve">‒ Ссылка на </w:t>
+      </w:r>
+      <w:r>
+        <w:rPr>
+          <w:lang w:val="ru-RU"/>
+          <w:rFonts w:ascii="Times New Roman" w:eastAsia="Times New Roman" w:hAnsi="Times New Roman"/>
+          <w:sz w:val="28"/>
+          <w:szCs w:val="28"/>
+          <w:rtl w:val="off"/>
+        </w:rPr>
+        <w:t xml:space="preserve">подключенное </w:t>
+      </w:r>
+      <w:r>
+        <w:rPr>
+          <w:lang w:val="en-US"/>
+          <w:rFonts w:ascii="Times New Roman" w:eastAsia="Times New Roman" w:hAnsi="Times New Roman"/>
+          <w:sz w:val="28"/>
+          <w:szCs w:val="28"/>
+          <w:rtl w:val="off"/>
+        </w:rPr>
+        <w:t>SATA</w:t>
+      </w:r>
+      <w:r>
+        <w:rPr>
+          <w:lang w:val="ru-RU"/>
+          <w:rFonts w:ascii="Times New Roman" w:eastAsia="Times New Roman" w:hAnsi="Times New Roman"/>
+          <w:sz w:val="28"/>
+          <w:szCs w:val="28"/>
+          <w:rtl w:val="off"/>
+        </w:rPr>
+        <w:t xml:space="preserve"> устройство</w:t>
+      </w:r>
+    </w:p>
+    <w:p>
+      <w:pPr>
+        <w:ind w:firstLine="708"/>
+        <w:jc w:val="both"/>
+        <w:spacing w:line="360"/>
+        <w:rPr>
+          <w:lang w:val="ru-RU"/>
+          <w:rFonts w:ascii="Times New Roman" w:eastAsia="Times New Roman" w:hAnsi="Times New Roman"/>
+          <w:sz w:val="28"/>
+          <w:szCs w:val="28"/>
+          <w:rtl w:val="off"/>
+        </w:rPr>
+      </w:pPr>
+      <w:r>
+        <w:rPr>
+          <w:lang w:val="ru-RU"/>
+          <w:rFonts w:ascii="Times New Roman" w:eastAsia="Times New Roman" w:hAnsi="Times New Roman"/>
+          <w:sz w:val="28"/>
+          <w:szCs w:val="28"/>
+          <w:rtl w:val="off"/>
+        </w:rPr>
+        <w:t xml:space="preserve">Далее я перенаправила вывод при помощи команды с повышенными привилегиями echo offline | sudo tee /sys/block/sdc/device/state (рис.42), чтобы отключить диск </w:t>
+      </w:r>
+      <w:r>
+        <w:rPr>
+          <w:lang w:val="en-US"/>
+          <w:rFonts w:ascii="Times New Roman" w:eastAsia="Times New Roman" w:hAnsi="Times New Roman"/>
+          <w:sz w:val="28"/>
+          <w:szCs w:val="28"/>
+          <w:rtl w:val="off"/>
+        </w:rPr>
+        <w:t>sdc</w:t>
+      </w:r>
+      <w:r>
+        <w:rPr>
+          <w:lang w:val="ru-RU"/>
+          <w:rFonts w:ascii="Times New Roman" w:eastAsia="Times New Roman" w:hAnsi="Times New Roman"/>
+          <w:sz w:val="28"/>
+          <w:szCs w:val="28"/>
+          <w:rtl w:val="off"/>
+        </w:rPr>
+        <w:t>.</w:t>
+      </w:r>
+    </w:p>
+    <w:p>
+      <w:pPr>
+        <w:ind w:firstLine="708"/>
+        <w:jc w:val="center"/>
+        <w:spacing w:line="360"/>
+        <w:rPr>
+          <w:lang w:val="ru-RU"/>
+          <w:rFonts w:ascii="Times New Roman" w:eastAsia="Times New Roman" w:hAnsi="Times New Roman"/>
+          <w:sz w:val="28"/>
+          <w:szCs w:val="28"/>
+          <w:rtl w:val="off"/>
+        </w:rPr>
+      </w:pPr>
+      <w:r>
+        <w:rPr>
+          <w:lang w:val="ru-RU"/>
+          <w:rFonts w:ascii="Times New Roman" w:eastAsia="Times New Roman" w:hAnsi="Times New Roman"/>
+          <w:sz w:val="28"/>
+          <w:szCs w:val="28"/>
+          <w:rtl w:val="off"/>
+        </w:rPr>
+        <w:drawing>
+          <wp:inline distT="0" distB="0" distL="180" distR="180">
+            <wp:extent cx="5940425" cy="318135"/>
+            <wp:effectExtent l="0" t="0" r="0" b="0"/>
+            <wp:docPr id="1066" name="shape1066" hidden="0"/>
+            <wp:cNvGraphicFramePr>
+              <a:graphicFrameLocks xmlns:a="http://schemas.openxmlformats.org/drawingml/2006/main" noChangeAspect="1"/>
+            </wp:cNvGraphicFramePr>
+            <a:graphic xmlns:a="http://schemas.openxmlformats.org/drawingml/2006/main">
+              <a:graphicData uri="http://schemas.openxmlformats.org/drawingml/2006/picture">
+                <pic:pic xmlns:pic="http://schemas.openxmlformats.org/drawingml/2006/picture">
+                  <pic:nvPicPr>
+                    <pic:cNvPr id="0" name="이미지"/>
+                    <pic:cNvPicPr preferRelativeResize="1">
+                      <a:picLocks noChangeAspect="1"/>
+                    </pic:cNvPicPr>
+                  </pic:nvPicPr>
+                  <pic:blipFill>
+                    <a:blip r:embed="rId42">
+                      <a:extLst>
+                        <a:ext uri="{28A0092B-C50C-407E-A947-70E740481C1C}">
+                          <a14:useLocalDpi xmlns:a14="http://schemas.microsoft.com/office/drawing/2010/main" val="0"/>
+                        </a:ext>
+                      </a:extLst>
+                    </a:blip>
+                    <a:srcRect/>
+                    <a:stretch>
+                      <a:fillRect/>
+                    </a:stretch>
+                  </pic:blipFill>
+                  <pic:spPr>
+                    <a:xfrm>
+                      <a:off x="0" y="0"/>
+                      <a:ext cx="5940425" cy="318135"/>
+                    </a:xfrm>
+                    <a:prstGeom prst="rect"/>
+                  </pic:spPr>
+                </pic:pic>
+              </a:graphicData>
+            </a:graphic>
+          </wp:inline>
+        </w:drawing>
+      </w:r>
+    </w:p>
+    <w:p>
+      <w:pPr>
+        <w:ind w:firstLine="708"/>
+        <w:jc w:val="center"/>
+        <w:spacing w:line="360"/>
+        <w:rPr>
+          <w:lang w:val="ru-RU"/>
+          <w:rFonts w:ascii="Times New Roman" w:eastAsia="Times New Roman" w:hAnsi="Times New Roman"/>
+          <w:sz w:val="28"/>
+          <w:szCs w:val="28"/>
+          <w:rtl w:val="off"/>
+        </w:rPr>
+      </w:pPr>
+      <w:r>
+        <w:rPr>
+          <w:lang w:val="ru-RU"/>
+          <w:rFonts w:ascii="Times New Roman" w:eastAsia="Times New Roman" w:hAnsi="Times New Roman"/>
+          <w:sz w:val="28"/>
+          <w:szCs w:val="28"/>
+          <w:rtl w:val="off"/>
+        </w:rPr>
+        <w:t xml:space="preserve">Рисунок 42 </w:t>
+      </w:r>
+      <w:r>
+        <w:rPr>
+          <w:lang w:val="ru-RU"/>
+          <w:rFonts w:ascii="Times New Roman" w:eastAsia="Times New Roman" w:hAnsi="Times New Roman" w:hint="default"/>
+          <w:sz w:val="28"/>
+          <w:szCs w:val="28"/>
+          <w:rtl w:val="off"/>
+        </w:rPr>
+        <w:t>‒ Результат выполнения команды echo offline | sudo tee /sys/block/sdc/device/state</w:t>
+      </w:r>
+    </w:p>
+    <w:p>
+      <w:pPr>
+        <w:ind w:firstLine="708"/>
+        <w:jc w:val="both"/>
+        <w:spacing w:line="360"/>
+        <w:rPr>
+          <w:lang w:val="ru-RU"/>
+          <w:rFonts w:ascii="Times New Roman" w:eastAsia="Times New Roman" w:hAnsi="Times New Roman"/>
+          <w:sz w:val="28"/>
+          <w:szCs w:val="28"/>
+          <w:rtl w:val="off"/>
+        </w:rPr>
+      </w:pPr>
+      <w:r>
+        <w:rPr>
+          <w:lang w:val="ru-RU"/>
+          <w:rFonts w:ascii="Times New Roman" w:eastAsia="Times New Roman" w:hAnsi="Times New Roman"/>
+          <w:sz w:val="28"/>
+          <w:szCs w:val="28"/>
+          <w:rtl w:val="off"/>
+        </w:rPr>
+        <w:t>Я сымитировала рассинхронизацию данных по дискам командой echo test &gt; /u01/testfile2.txt (рис.43).</w:t>
+      </w:r>
+    </w:p>
+    <w:p>
+      <w:pPr>
+        <w:ind w:firstLine="708"/>
+        <w:jc w:val="center"/>
+        <w:spacing w:line="360"/>
+        <w:rPr>
+          <w:lang w:val="ru-RU"/>
+          <w:rFonts w:ascii="Times New Roman" w:eastAsia="Times New Roman" w:hAnsi="Times New Roman"/>
+          <w:sz w:val="28"/>
+          <w:szCs w:val="28"/>
+          <w:rtl w:val="off"/>
+        </w:rPr>
+      </w:pPr>
+      <w:r>
+        <w:rPr>
+          <w:lang w:val="ru-RU"/>
+          <w:rFonts w:ascii="Times New Roman" w:eastAsia="Times New Roman" w:hAnsi="Times New Roman"/>
+          <w:sz w:val="28"/>
+          <w:szCs w:val="28"/>
+          <w:rtl w:val="off"/>
+        </w:rPr>
+        <w:drawing>
+          <wp:inline distT="0" distB="0" distL="180" distR="180">
+            <wp:extent cx="4743450" cy="311150"/>
+            <wp:effectExtent l="0" t="0" r="0" b="0"/>
+            <wp:docPr id="1067" name="shape1067" hidden="0"/>
+            <wp:cNvGraphicFramePr>
+              <a:graphicFrameLocks xmlns:a="http://schemas.openxmlformats.org/drawingml/2006/main" noChangeAspect="1"/>
+            </wp:cNvGraphicFramePr>
+            <a:graphic xmlns:a="http://schemas.openxmlformats.org/drawingml/2006/main">
+              <a:graphicData uri="http://schemas.openxmlformats.org/drawingml/2006/picture">
+                <pic:pic xmlns:pic="http://schemas.openxmlformats.org/drawingml/2006/picture">
+                  <pic:nvPicPr>
+                    <pic:cNvPr id="0" name="이미지"/>
+                    <pic:cNvPicPr preferRelativeResize="1">
+                      <a:picLocks noChangeAspect="1"/>
+                    </pic:cNvPicPr>
+                  </pic:nvPicPr>
+                  <pic:blipFill>
+                    <a:blip r:embed="rId43">
+                      <a:extLst>
+                        <a:ext uri="{28A0092B-C50C-407E-A947-70E740481C1C}">
+                          <a14:useLocalDpi xmlns:a14="http://schemas.microsoft.com/office/drawing/2010/main" val="0"/>
+                        </a:ext>
+                      </a:extLst>
+                    </a:blip>
+                    <a:srcRect/>
+                    <a:stretch>
+                      <a:fillRect/>
+                    </a:stretch>
+                  </pic:blipFill>
+                  <pic:spPr>
+                    <a:xfrm>
+                      <a:off x="0" y="0"/>
+                      <a:ext cx="4743450" cy="311150"/>
+                    </a:xfrm>
+                    <a:prstGeom prst="rect"/>
+                  </pic:spPr>
+                </pic:pic>
+              </a:graphicData>
+            </a:graphic>
+          </wp:inline>
+        </w:drawing>
+      </w:r>
+    </w:p>
+    <w:p>
+      <w:pPr>
+        <w:ind w:firstLine="708"/>
+        <w:jc w:val="center"/>
+        <w:spacing w:line="360"/>
+        <w:rPr>
+          <w:lang w:val="ru-RU"/>
+          <w:rFonts w:ascii="Times New Roman" w:eastAsia="Times New Roman" w:hAnsi="Times New Roman"/>
+          <w:sz w:val="28"/>
+          <w:szCs w:val="28"/>
+          <w:rtl w:val="off"/>
+        </w:rPr>
+      </w:pPr>
+      <w:r>
+        <w:rPr>
+          <w:lang w:val="ru-RU"/>
+          <w:rFonts w:ascii="Times New Roman" w:eastAsia="Times New Roman" w:hAnsi="Times New Roman"/>
+          <w:sz w:val="28"/>
+          <w:szCs w:val="28"/>
+          <w:rtl w:val="off"/>
+        </w:rPr>
+        <w:t xml:space="preserve">Рисунок 43 </w:t>
+      </w:r>
+      <w:r>
+        <w:rPr>
+          <w:lang w:val="ru-RU"/>
+          <w:rFonts w:ascii="Times New Roman" w:eastAsia="Times New Roman" w:hAnsi="Times New Roman" w:hint="default"/>
+          <w:sz w:val="28"/>
+          <w:szCs w:val="28"/>
+          <w:rtl w:val="off"/>
+        </w:rPr>
+        <w:t>‒ Рассинхронизация данных</w:t>
+      </w:r>
+    </w:p>
+    <w:p>
+      <w:pPr>
+        <w:ind w:firstLine="708"/>
+        <w:jc w:val="both"/>
+        <w:spacing w:line="360"/>
+        <w:rPr>
+          <w:lang w:val="ru-RU"/>
+          <w:rFonts w:ascii="Times New Roman" w:eastAsia="Times New Roman" w:hAnsi="Times New Roman"/>
+          <w:sz w:val="28"/>
+          <w:szCs w:val="28"/>
+          <w:rtl w:val="off"/>
+        </w:rPr>
+      </w:pPr>
+      <w:r>
+        <w:rPr>
+          <w:lang w:val="ru-RU"/>
+          <w:rFonts w:ascii="Times New Roman" w:eastAsia="Times New Roman" w:hAnsi="Times New Roman"/>
+          <w:sz w:val="28"/>
+          <w:szCs w:val="28"/>
+          <w:rtl w:val="off"/>
+        </w:rPr>
+        <w:t xml:space="preserve">Проверка состояния </w:t>
+      </w:r>
+      <w:r>
+        <w:rPr>
+          <w:lang w:val="en-US"/>
+          <w:rFonts w:ascii="Times New Roman" w:eastAsia="Times New Roman" w:hAnsi="Times New Roman"/>
+          <w:sz w:val="28"/>
+          <w:szCs w:val="28"/>
+          <w:rtl w:val="off"/>
+        </w:rPr>
+        <w:t xml:space="preserve">RAID </w:t>
+      </w:r>
+      <w:r>
+        <w:rPr>
+          <w:lang w:val="ru-RU"/>
+          <w:rFonts w:ascii="Times New Roman" w:eastAsia="Times New Roman" w:hAnsi="Times New Roman"/>
+          <w:sz w:val="28"/>
+          <w:szCs w:val="28"/>
+          <w:rtl w:val="off"/>
+        </w:rPr>
+        <w:t xml:space="preserve">массива показала, что был не найдено устройство с указанным </w:t>
+      </w:r>
+      <w:r>
+        <w:rPr>
+          <w:lang w:val="en-US"/>
+          <w:rFonts w:ascii="Times New Roman" w:eastAsia="Times New Roman" w:hAnsi="Times New Roman"/>
+          <w:sz w:val="28"/>
+          <w:szCs w:val="28"/>
+          <w:rtl w:val="off"/>
+        </w:rPr>
+        <w:t>uuid</w:t>
+      </w:r>
+      <w:r>
+        <w:rPr>
+          <w:lang w:val="ru-RU"/>
+          <w:rFonts w:ascii="Times New Roman" w:eastAsia="Times New Roman" w:hAnsi="Times New Roman"/>
+          <w:sz w:val="28"/>
+          <w:szCs w:val="28"/>
+          <w:rtl w:val="off"/>
+        </w:rPr>
+        <w:t xml:space="preserve"> (диск </w:t>
+      </w:r>
+      <w:r>
+        <w:rPr>
+          <w:lang w:val="en-US"/>
+          <w:rFonts w:ascii="Times New Roman" w:eastAsia="Times New Roman" w:hAnsi="Times New Roman"/>
+          <w:sz w:val="28"/>
+          <w:szCs w:val="28"/>
+          <w:rtl w:val="off"/>
+        </w:rPr>
+        <w:t>sdc</w:t>
+      </w:r>
+      <w:r>
+        <w:rPr>
+          <w:lang w:val="ru-RU"/>
+          <w:rFonts w:ascii="Times New Roman" w:eastAsia="Times New Roman" w:hAnsi="Times New Roman"/>
+          <w:sz w:val="28"/>
+          <w:szCs w:val="28"/>
+          <w:rtl w:val="off"/>
+        </w:rPr>
+        <w:t xml:space="preserve">) (рис.44). Состояние массива стало </w:t>
+      </w:r>
+      <w:r>
+        <w:rPr>
+          <w:lang w:val="en-US"/>
+          <w:rFonts w:ascii="Times New Roman" w:eastAsia="Times New Roman" w:hAnsi="Times New Roman"/>
+          <w:sz w:val="28"/>
+          <w:szCs w:val="28"/>
+          <w:rtl w:val="off"/>
+        </w:rPr>
+        <w:t>partial</w:t>
+      </w:r>
+      <w:r>
+        <w:rPr>
+          <w:lang w:val="ru-RU"/>
+          <w:rFonts w:ascii="Times New Roman" w:eastAsia="Times New Roman" w:hAnsi="Times New Roman"/>
+          <w:sz w:val="28"/>
+          <w:szCs w:val="28"/>
+          <w:rtl w:val="off"/>
+        </w:rPr>
+        <w:t>.</w:t>
+      </w:r>
+    </w:p>
+    <w:p>
+      <w:pPr>
+        <w:ind w:firstLine="708"/>
+        <w:jc w:val="center"/>
+        <w:spacing w:line="360"/>
+        <w:rPr>
+          <w:lang w:val="ru-RU"/>
+          <w:rFonts w:ascii="Times New Roman" w:eastAsia="Times New Roman" w:hAnsi="Times New Roman"/>
+          <w:sz w:val="28"/>
+          <w:szCs w:val="28"/>
+          <w:rtl w:val="off"/>
+        </w:rPr>
+      </w:pPr>
+      <w:r>
+        <w:rPr>
+          <w:lang w:val="ru-RU"/>
+          <w:rFonts w:ascii="Times New Roman" w:eastAsia="Times New Roman" w:hAnsi="Times New Roman"/>
+          <w:sz w:val="28"/>
+          <w:szCs w:val="28"/>
+          <w:rtl w:val="off"/>
+        </w:rPr>
+        <w:drawing>
+          <wp:inline distT="0" distB="0" distL="180" distR="180">
+            <wp:extent cx="5940425" cy="974090"/>
+            <wp:effectExtent l="0" t="0" r="0" b="0"/>
+            <wp:docPr id="1068" name="shape1068" hidden="0"/>
+            <wp:cNvGraphicFramePr>
+              <a:graphicFrameLocks xmlns:a="http://schemas.openxmlformats.org/drawingml/2006/main" noChangeAspect="1"/>
+            </wp:cNvGraphicFramePr>
+            <a:graphic xmlns:a="http://schemas.openxmlformats.org/drawingml/2006/main">
+              <a:graphicData uri="http://schemas.openxmlformats.org/drawingml/2006/picture">
+                <pic:pic xmlns:pic="http://schemas.openxmlformats.org/drawingml/2006/picture">
+                  <pic:nvPicPr>
+                    <pic:cNvPr id="0" name="이미지"/>
+                    <pic:cNvPicPr preferRelativeResize="1">
+                      <a:picLocks noChangeAspect="1"/>
+                    </pic:cNvPicPr>
+                  </pic:nvPicPr>
+                  <pic:blipFill>
+                    <a:blip r:embed="rId44">
+                      <a:extLst>
+                        <a:ext uri="{28A0092B-C50C-407E-A947-70E740481C1C}">
+                          <a14:useLocalDpi xmlns:a14="http://schemas.microsoft.com/office/drawing/2010/main" val="0"/>
+                        </a:ext>
+                      </a:extLst>
+                    </a:blip>
+                    <a:srcRect/>
+                    <a:stretch>
+                      <a:fillRect/>
+                    </a:stretch>
+                  </pic:blipFill>
+                  <pic:spPr>
+                    <a:xfrm>
+                      <a:off x="0" y="0"/>
+                      <a:ext cx="5940425" cy="974090"/>
+                    </a:xfrm>
+                    <a:prstGeom prst="rect"/>
+                  </pic:spPr>
+                </pic:pic>
+              </a:graphicData>
+            </a:graphic>
+          </wp:inline>
+        </w:drawing>
+      </w:r>
+    </w:p>
+    <w:p>
+      <w:pPr>
+        <w:ind w:firstLine="708"/>
+        <w:jc w:val="center"/>
+        <w:spacing w:line="360"/>
+        <w:rPr>
+          <w:rFonts w:ascii="Times New Roman" w:eastAsia="Times New Roman" w:hAnsi="Times New Roman" w:hint="default"/>
+          <w:sz w:val="28"/>
+          <w:szCs w:val="28"/>
+        </w:rPr>
+      </w:pPr>
+      <w:r>
+        <w:rPr>
+          <w:lang w:val="ru-RU"/>
+          <w:rFonts w:ascii="Times New Roman" w:eastAsia="Times New Roman" w:hAnsi="Times New Roman"/>
+          <w:sz w:val="28"/>
+          <w:szCs w:val="28"/>
+          <w:rtl w:val="off"/>
+        </w:rPr>
+        <w:t xml:space="preserve">Рисунок 44 </w:t>
+      </w:r>
+      <w:r>
+        <w:rPr>
+          <w:lang w:val="ru-RU"/>
+          <w:rFonts w:ascii="Times New Roman" w:eastAsia="Times New Roman" w:hAnsi="Times New Roman" w:hint="default"/>
+          <w:sz w:val="28"/>
+          <w:szCs w:val="28"/>
+          <w:rtl w:val="off"/>
+        </w:rPr>
+        <w:t>‒ Состояние массива после создания нового файла</w:t>
+      </w:r>
+      <w:r>
+        <w:rPr>
+          <w:rFonts w:ascii="Times New Roman" w:eastAsia="Times New Roman" w:hAnsi="Times New Roman" w:hint="default"/>
+          <w:sz w:val="28"/>
+          <w:szCs w:val="28"/>
+        </w:rPr>
+        <w:br w:type="page"/>
+      </w:r>
+    </w:p>
+    <w:p>
+      <w:pPr>
+        <w:ind w:firstLine="708"/>
+        <w:jc w:val="both"/>
+        <w:spacing w:line="360"/>
+        <w:rPr>
+          <w:rFonts w:ascii="Times New Roman" w:eastAsia="Times New Roman" w:hAnsi="Times New Roman" w:hint="default"/>
+          <w:sz w:val="28"/>
+          <w:szCs w:val="28"/>
+        </w:rPr>
+      </w:pPr>
+      <w:r>
+        <w:rPr>
+          <w:lang w:val="ru-RU"/>
+          <w:rFonts w:ascii="Times New Roman" w:eastAsia="Times New Roman" w:hAnsi="Times New Roman" w:hint="default"/>
+          <w:sz w:val="28"/>
+          <w:szCs w:val="28"/>
+          <w:rtl w:val="off"/>
+        </w:rPr>
+        <w:t>6.3. Восстановление диска.</w:t>
+      </w:r>
+      <w:r>
+        <w:rPr>
+          <w:lang w:val="ru-RU"/>
+          <w:rFonts w:ascii="Times New Roman" w:eastAsia="Times New Roman" w:hAnsi="Times New Roman"/>
+          <w:sz w:val="28"/>
+          <w:szCs w:val="28"/>
+          <w:rtl w:val="off"/>
+        </w:rPr>
+        <w:br/>
+      </w:r>
+    </w:p>
+    <w:p>
+      <w:pPr>
+        <w:ind w:firstLine="708"/>
+        <w:jc w:val="both"/>
+        <w:spacing w:line="360"/>
+        <w:rPr>
+          <w:rFonts w:ascii="Times New Roman" w:eastAsia="Times New Roman" w:hAnsi="Times New Roman" w:hint="default"/>
+          <w:sz w:val="28"/>
+          <w:szCs w:val="28"/>
+        </w:rPr>
+      </w:pPr>
+      <w:r>
+        <w:rPr>
+          <w:rFonts w:ascii="Times New Roman" w:eastAsia="Times New Roman" w:hAnsi="Times New Roman" w:hint="default"/>
+          <w:sz w:val="28"/>
+          <w:szCs w:val="28"/>
+        </w:rPr>
+        <w:br w:type="page"/>
+      </w:r>
+    </w:p>
+    <w:p>
+      <w:pPr>
+        <w:ind w:firstLine="708"/>
+        <w:jc w:val="both"/>
+        <w:spacing w:line="360"/>
+        <w:rPr>
+          <w:rFonts w:ascii="Times New Roman" w:eastAsia="Times New Roman" w:hAnsi="Times New Roman" w:hint="default"/>
+          <w:sz w:val="28"/>
+          <w:szCs w:val="28"/>
+        </w:rPr>
+      </w:pPr>
+      <w:r>
+        <w:rPr>
+          <w:lang w:val="ru-RU"/>
+          <w:rFonts w:ascii="Times New Roman" w:eastAsia="Times New Roman" w:hAnsi="Times New Roman" w:hint="default"/>
+          <w:sz w:val="28"/>
+          <w:szCs w:val="28"/>
+          <w:rtl w:val="off"/>
+        </w:rPr>
+        <w:t xml:space="preserve">Ссылка: </w:t>
+      </w:r>
+      <w:r>
+        <w:rPr>
+          <w:rFonts w:ascii="Times New Roman" w:eastAsia="Times New Roman" w:hAnsi="Times New Roman" w:hint="default"/>
+          <w:sz w:val="28"/>
+          <w:szCs w:val="28"/>
+        </w:rPr>
+        <w:fldChar w:fldCharType="begin"/>
+      </w:r>
+      <w:r>
+        <w:rPr>
+          <w:rFonts w:ascii="Times New Roman" w:eastAsia="Times New Roman" w:hAnsi="Times New Roman" w:hint="default"/>
+          <w:sz w:val="28"/>
+          <w:szCs w:val="28"/>
+        </w:rPr>
+        <w:instrText xml:space="preserve"> HYPERLINK "https://gitverse.ru/ildarka/ais/content/master/practice%2F03_lvm.md" </w:instrText>
+      </w:r>
+      <w:r>
+        <w:rPr>
+          <w:rFonts w:ascii="Times New Roman" w:eastAsia="Times New Roman" w:hAnsi="Times New Roman" w:hint="default"/>
+          <w:sz w:val="28"/>
+          <w:szCs w:val="28"/>
+        </w:rPr>
+        <w:fldChar w:fldCharType="separate"/>
+      </w:r>
+      <w:r>
+        <w:rPr>
+          <w:rStyle w:val="afffffe"/>
+          <w:rFonts w:ascii="Times New Roman" w:eastAsia="Times New Roman" w:hAnsi="Times New Roman" w:hint="default"/>
+          <w:sz w:val="28"/>
+          <w:szCs w:val="28"/>
+        </w:rPr>
+        <w:t>https://gitverse.ru/ildarka/ais/content/master/practice%2F03_lvm.md</w:t>
+      </w:r>
+      <w:r>
+        <w:rPr>
+          <w:rFonts w:ascii="Times New Roman" w:eastAsia="Times New Roman" w:hAnsi="Times New Roman" w:hint="default"/>
+          <w:sz w:val="28"/>
+          <w:szCs w:val="28"/>
+        </w:rPr>
+        <w:fldChar w:fldCharType="end"/>
       </w:r>
     </w:p>
     <w:sectPr>
@@ -9044,7 +10290,7 @@
       <w:pgMar w:top="1134" w:right="850" w:bottom="1134" w:left="1701" w:header="708" w:footer="708" w:gutter="0"/>
       <w:cols w:space="708"/>
       <w:docGrid w:linePitch="360"/>
-      <w:footerReference w:type="default" r:id="rId38"/>
+      <w:footerReference w:type="default" r:id="rId45"/>
       <w:titlePg/>
     </w:sectPr>
   </w:body>
@@ -9289,22 +10535,22 @@
     <w:lsdException w:name="index 7" w:semiHidden="1" w:unhideWhenUsed="1"/>
     <w:lsdException w:name="index 8" w:semiHidden="1" w:unhideWhenUsed="1"/>
     <w:lsdException w:name="index 9" w:semiHidden="1" w:unhideWhenUsed="1"/>
-    <w:lsdException w:name="toc 1" w:semiHidden="1" w:uiPriority="309" w:unhideWhenUsed="1"/>
-    <w:lsdException w:name="toc 2" w:semiHidden="1" w:uiPriority="309" w:unhideWhenUsed="1"/>
-    <w:lsdException w:name="toc 3" w:semiHidden="1" w:uiPriority="309" w:unhideWhenUsed="1"/>
-    <w:lsdException w:name="toc 4" w:semiHidden="1" w:uiPriority="309" w:unhideWhenUsed="1"/>
-    <w:lsdException w:name="toc 5" w:semiHidden="1" w:uiPriority="309" w:unhideWhenUsed="1"/>
-    <w:lsdException w:name="toc 6" w:semiHidden="1" w:uiPriority="309" w:unhideWhenUsed="1"/>
-    <w:lsdException w:name="toc 7" w:semiHidden="1" w:uiPriority="309" w:unhideWhenUsed="1"/>
-    <w:lsdException w:name="toc 8" w:semiHidden="1" w:uiPriority="309" w:unhideWhenUsed="1"/>
-    <w:lsdException w:name="toc 9" w:semiHidden="1" w:uiPriority="309" w:unhideWhenUsed="1"/>
+    <w:lsdException w:name="toc 1" w:semiHidden="1" w:uiPriority="777" w:unhideWhenUsed="1"/>
+    <w:lsdException w:name="toc 2" w:semiHidden="1" w:uiPriority="777" w:unhideWhenUsed="1"/>
+    <w:lsdException w:name="toc 3" w:semiHidden="1" w:uiPriority="777" w:unhideWhenUsed="1"/>
+    <w:lsdException w:name="toc 4" w:semiHidden="1" w:uiPriority="777" w:unhideWhenUsed="1"/>
+    <w:lsdException w:name="toc 5" w:semiHidden="1" w:uiPriority="777" w:unhideWhenUsed="1"/>
+    <w:lsdException w:name="toc 6" w:semiHidden="1" w:uiPriority="777" w:unhideWhenUsed="1"/>
+    <w:lsdException w:name="toc 7" w:semiHidden="1" w:uiPriority="777" w:unhideWhenUsed="1"/>
+    <w:lsdException w:name="toc 8" w:semiHidden="1" w:uiPriority="777" w:unhideWhenUsed="1"/>
+    <w:lsdException w:name="toc 9" w:semiHidden="1" w:uiPriority="777" w:unhideWhenUsed="1"/>
     <w:lsdException w:name="Normal Indent" w:semiHidden="1" w:unhideWhenUsed="1"/>
     <w:lsdException w:name="footnote text" w:semiHidden="1" w:unhideWhenUsed="1"/>
     <w:lsdException w:name="annotation text" w:semiHidden="1" w:unhideWhenUsed="1"/>
     <w:lsdException w:name="header" w:semiHidden="1" w:unhideWhenUsed="1"/>
     <w:lsdException w:name="footer" w:semiHidden="1" w:unhideWhenUsed="1"/>
     <w:lsdException w:name="index heading" w:semiHidden="1" w:unhideWhenUsed="1"/>
-    <w:lsdException w:name="caption" w:semiHidden="1" w:uiPriority="305" w:unhideWhenUsed="1" w:qFormat="1"/>
+    <w:lsdException w:name="caption" w:semiHidden="1" w:uiPriority="773" w:unhideWhenUsed="1" w:qFormat="1"/>
     <w:lsdException w:name="table of figures" w:semiHidden="1" w:unhideWhenUsed="1"/>
     <w:lsdException w:name="envelope address" w:semiHidden="1" w:unhideWhenUsed="1"/>
     <w:lsdException w:name="envelope return" w:semiHidden="1" w:unhideWhenUsed="1"/>
@@ -9332,7 +10578,7 @@
     <w:lsdException w:name="List Number 3" w:semiHidden="1" w:unhideWhenUsed="1"/>
     <w:lsdException w:name="List Number 4" w:semiHidden="1" w:unhideWhenUsed="1"/>
     <w:lsdException w:name="List Number 5" w:semiHidden="1" w:unhideWhenUsed="1"/>
-    <w:lsdException w:name="Title" w:uiPriority="52" w:qFormat="1"/>
+    <w:lsdException w:name="Title" w:uiPriority="82" w:qFormat="1"/>
     <w:lsdException w:name="Closing" w:semiHidden="1" w:unhideWhenUsed="1"/>
     <w:lsdException w:name="Signature" w:semiHidden="1" w:unhideWhenUsed="1"/>
     <w:lsdException w:name="Default Paragraph Font" w:semiHidden="1" w:uiPriority="1" w:unhideWhenUsed="1"/>
@@ -9344,7 +10590,7 @@
     <w:lsdException w:name="List Continue 4" w:semiHidden="1" w:unhideWhenUsed="1"/>
     <w:lsdException w:name="List Continue 5" w:semiHidden="1" w:unhideWhenUsed="1"/>
     <w:lsdException w:name="Message Header" w:semiHidden="1" w:unhideWhenUsed="1"/>
-    <w:lsdException w:name="Subtitle" w:uiPriority="53" w:qFormat="1"/>
+    <w:lsdException w:name="Subtitle" w:uiPriority="83" w:qFormat="1"/>
     <w:lsdException w:name="Salutation" w:semiHidden="1" w:unhideWhenUsed="1"/>
     <w:lsdException w:name="Date" w:semiHidden="1" w:unhideWhenUsed="1"/>
     <w:lsdException w:name="Body Text First Indent" w:semiHidden="1" w:unhideWhenUsed="1"/>
@@ -9357,8 +10603,8 @@
     <w:lsdException w:name="Block Text" w:semiHidden="1" w:unhideWhenUsed="1"/>
     <w:lsdException w:name="Hyperlink" w:semiHidden="1" w:unhideWhenUsed="1"/>
     <w:lsdException w:name="FollowedHyperlink" w:semiHidden="1" w:unhideWhenUsed="1"/>
-    <w:lsdException w:name="Strong" w:uiPriority="130" w:qFormat="1"/>
-    <w:lsdException w:name="Emphasis" w:uiPriority="128" w:qFormat="1"/>
+    <w:lsdException w:name="Strong" w:uiPriority="304" w:qFormat="1"/>
+    <w:lsdException w:name="Emphasis" w:uiPriority="296" w:qFormat="1"/>
     <w:lsdException w:name="Document Map" w:semiHidden="1" w:unhideWhenUsed="1"/>
     <w:lsdException w:name="Plain Text" w:semiHidden="1" w:unhideWhenUsed="1"/>
     <w:lsdException w:name="E-mail Signature" w:semiHidden="1" w:unhideWhenUsed="1"/>
@@ -9424,223 +10670,223 @@
     <w:lsdException w:name="Table Web 2" w:semiHidden="1" w:unhideWhenUsed="1"/>
     <w:lsdException w:name="Table Web 3" w:semiHidden="1" w:unhideWhenUsed="1"/>
     <w:lsdException w:name="Balloon Text" w:semiHidden="1" w:unhideWhenUsed="1"/>
-    <w:lsdException w:name="Table Grid" w:uiPriority="309"/>
+    <w:lsdException w:name="Table Grid" w:uiPriority="777"/>
     <w:lsdException w:name="Table Theme" w:semiHidden="1" w:unhideWhenUsed="1"/>
     <w:lsdException w:name="Placeholder Text" w:semiHidden="1"/>
     <w:lsdException w:name="No Spacing" w:uiPriority="1" w:qFormat="1"/>
-    <w:lsdException w:name="Light Shading" w:uiPriority="822"/>
-    <w:lsdException w:name="Light List" w:uiPriority="823"/>
-    <w:lsdException w:name="Light Grid" w:uiPriority="824"/>
-    <w:lsdException w:name="Medium Shading 1" w:uiPriority="825"/>
-    <w:lsdException w:name="Medium Shading 2" w:uiPriority="1432"/>
-    <w:lsdException w:name="Medium List 1" w:uiPriority="1433"/>
-    <w:lsdException w:name="Medium List 2" w:uiPriority="1536"/>
-    <w:lsdException w:name="Medium Grid 1" w:uiPriority="1537"/>
-    <w:lsdException w:name="Medium Grid 2" w:uiPriority="1544"/>
-    <w:lsdException w:name="Medium Grid 3" w:uiPriority="1545"/>
-    <w:lsdException w:name="Dark List" w:uiPriority="1576"/>
-    <w:lsdException w:name="Colorful Shading" w:uiPriority="1577"/>
-    <w:lsdException w:name="Colorful List" w:uiPriority="1584"/>
-    <w:lsdException w:name="Colorful Grid" w:uiPriority="1585"/>
-    <w:lsdException w:name="Light Shading Accent 1" w:uiPriority="822"/>
-    <w:lsdException w:name="Light List Accent 1" w:uiPriority="823"/>
-    <w:lsdException w:name="Light Grid Accent 1" w:uiPriority="824"/>
-    <w:lsdException w:name="Medium Shading 1 Accent 1" w:uiPriority="825"/>
-    <w:lsdException w:name="Medium Shading 2 Accent 1" w:uiPriority="1432"/>
-    <w:lsdException w:name="Medium List 1 Accent 1" w:uiPriority="1433"/>
+    <w:lsdException w:name="Light Shading" w:uiPriority="2082"/>
+    <w:lsdException w:name="Light List" w:uiPriority="2083"/>
+    <w:lsdException w:name="Light Grid" w:uiPriority="2084"/>
+    <w:lsdException w:name="Medium Shading 1" w:uiPriority="2085"/>
+    <w:lsdException w:name="Medium Shading 2" w:uiPriority="5170"/>
+    <w:lsdException w:name="Medium List 1" w:uiPriority="5171"/>
+    <w:lsdException w:name="Medium List 2" w:uiPriority="5430"/>
+    <w:lsdException w:name="Medium Grid 1" w:uiPriority="5431"/>
+    <w:lsdException w:name="Medium Grid 2" w:uiPriority="5444"/>
+    <w:lsdException w:name="Medium Grid 3" w:uiPriority="5445"/>
+    <w:lsdException w:name="Dark List" w:uiPriority="5494"/>
+    <w:lsdException w:name="Colorful Shading" w:uiPriority="5495"/>
+    <w:lsdException w:name="Colorful List" w:uiPriority="5508"/>
+    <w:lsdException w:name="Colorful Grid" w:uiPriority="5509"/>
+    <w:lsdException w:name="Light Shading Accent 1" w:uiPriority="2082"/>
+    <w:lsdException w:name="Light List Accent 1" w:uiPriority="2083"/>
+    <w:lsdException w:name="Light Grid Accent 1" w:uiPriority="2084"/>
+    <w:lsdException w:name="Medium Shading 1 Accent 1" w:uiPriority="2085"/>
+    <w:lsdException w:name="Medium Shading 2 Accent 1" w:uiPriority="5170"/>
+    <w:lsdException w:name="Medium List 1 Accent 1" w:uiPriority="5171"/>
     <w:lsdException w:name="Revision" w:semiHidden="1"/>
-    <w:lsdException w:name="List Paragraph" w:uiPriority="304" w:qFormat="1"/>
-    <w:lsdException w:name="Quote" w:uiPriority="257" w:qFormat="1"/>
-    <w:lsdException w:name="Intense Quote" w:uiPriority="276" w:qFormat="1"/>
-    <w:lsdException w:name="Medium List 2 Accent 1" w:uiPriority="1536"/>
-    <w:lsdException w:name="Medium Grid 1 Accent 1" w:uiPriority="1537"/>
-    <w:lsdException w:name="Medium Grid 2 Accent 1" w:uiPriority="1544"/>
-    <w:lsdException w:name="Medium Grid 3 Accent 1" w:uiPriority="1545"/>
-    <w:lsdException w:name="Dark List Accent 1" w:uiPriority="1576"/>
-    <w:lsdException w:name="Colorful Shading Accent 1" w:uiPriority="1577"/>
-    <w:lsdException w:name="Colorful List Accent 1" w:uiPriority="1584"/>
-    <w:lsdException w:name="Colorful Grid Accent 1" w:uiPriority="1585"/>
-    <w:lsdException w:name="Light Shading Accent 2" w:uiPriority="822"/>
-    <w:lsdException w:name="Light List Accent 2" w:uiPriority="823"/>
-    <w:lsdException w:name="Light Grid Accent 2" w:uiPriority="824"/>
-    <w:lsdException w:name="Medium Shading 1 Accent 2" w:uiPriority="825"/>
-    <w:lsdException w:name="Medium Shading 2 Accent 2" w:uiPriority="1432"/>
-    <w:lsdException w:name="Medium List 1 Accent 2" w:uiPriority="1433"/>
-    <w:lsdException w:name="Medium List 2 Accent 2" w:uiPriority="1536"/>
-    <w:lsdException w:name="Medium Grid 1 Accent 2" w:uiPriority="1537"/>
-    <w:lsdException w:name="Medium Grid 2 Accent 2" w:uiPriority="1544"/>
-    <w:lsdException w:name="Medium Grid 3 Accent 2" w:uiPriority="1545"/>
-    <w:lsdException w:name="Dark List Accent 2" w:uiPriority="1576"/>
-    <w:lsdException w:name="Colorful Shading Accent 2" w:uiPriority="1577"/>
-    <w:lsdException w:name="Colorful List Accent 2" w:uiPriority="1584"/>
-    <w:lsdException w:name="Colorful Grid Accent 2" w:uiPriority="1585"/>
-    <w:lsdException w:name="Light Shading Accent 3" w:uiPriority="822"/>
-    <w:lsdException w:name="Light List Accent 3" w:uiPriority="823"/>
-    <w:lsdException w:name="Light Grid Accent 3" w:uiPriority="824"/>
-    <w:lsdException w:name="Medium Shading 1 Accent 3" w:uiPriority="825"/>
-    <w:lsdException w:name="Medium Shading 2 Accent 3" w:uiPriority="1432"/>
-    <w:lsdException w:name="Medium List 1 Accent 3" w:uiPriority="1433"/>
-    <w:lsdException w:name="Medium List 2 Accent 3" w:uiPriority="1536"/>
-    <w:lsdException w:name="Medium Grid 1 Accent 3" w:uiPriority="1537"/>
-    <w:lsdException w:name="Medium Grid 2 Accent 3" w:uiPriority="1544"/>
-    <w:lsdException w:name="Medium Grid 3 Accent 3" w:uiPriority="1545"/>
-    <w:lsdException w:name="Dark List Accent 3" w:uiPriority="1576"/>
-    <w:lsdException w:name="Colorful Shading Accent 3" w:uiPriority="1577"/>
-    <w:lsdException w:name="Colorful List Accent 3" w:uiPriority="1584"/>
-    <w:lsdException w:name="Colorful Grid Accent 3" w:uiPriority="1585"/>
-    <w:lsdException w:name="Light Shading Accent 4" w:uiPriority="822"/>
-    <w:lsdException w:name="Light List Accent 4" w:uiPriority="823"/>
-    <w:lsdException w:name="Light Grid Accent 4" w:uiPriority="824"/>
-    <w:lsdException w:name="Medium Shading 1 Accent 4" w:uiPriority="825"/>
-    <w:lsdException w:name="Medium Shading 2 Accent 4" w:uiPriority="1432"/>
-    <w:lsdException w:name="Medium List 1 Accent 4" w:uiPriority="1433"/>
-    <w:lsdException w:name="Medium List 2 Accent 4" w:uiPriority="1536"/>
-    <w:lsdException w:name="Medium Grid 1 Accent 4" w:uiPriority="1537"/>
-    <w:lsdException w:name="Medium Grid 2 Accent 4" w:uiPriority="1544"/>
-    <w:lsdException w:name="Medium Grid 3 Accent 4" w:uiPriority="1545"/>
-    <w:lsdException w:name="Dark List Accent 4" w:uiPriority="1576"/>
-    <w:lsdException w:name="Colorful Shading Accent 4" w:uiPriority="1577"/>
-    <w:lsdException w:name="Colorful List Accent 4" w:uiPriority="1584"/>
-    <w:lsdException w:name="Colorful Grid Accent 4" w:uiPriority="1585"/>
-    <w:lsdException w:name="Light Shading Accent 5" w:uiPriority="822"/>
-    <w:lsdException w:name="Light List Accent 5" w:uiPriority="823"/>
-    <w:lsdException w:name="Light Grid Accent 5" w:uiPriority="824"/>
-    <w:lsdException w:name="Medium Shading 1 Accent 5" w:uiPriority="825"/>
-    <w:lsdException w:name="Medium Shading 2 Accent 5" w:uiPriority="1432"/>
-    <w:lsdException w:name="Medium List 1 Accent 5" w:uiPriority="1433"/>
-    <w:lsdException w:name="Medium List 2 Accent 5" w:uiPriority="1536"/>
-    <w:lsdException w:name="Medium Grid 1 Accent 5" w:uiPriority="1537"/>
-    <w:lsdException w:name="Medium Grid 2 Accent 5" w:uiPriority="1544"/>
-    <w:lsdException w:name="Medium Grid 3 Accent 5" w:uiPriority="1545"/>
-    <w:lsdException w:name="Dark List Accent 5" w:uiPriority="1576"/>
-    <w:lsdException w:name="Colorful Shading Accent 5" w:uiPriority="1577"/>
-    <w:lsdException w:name="Colorful List Accent 5" w:uiPriority="1584"/>
-    <w:lsdException w:name="Colorful Grid Accent 5" w:uiPriority="1585"/>
-    <w:lsdException w:name="Light Shading Accent 6" w:uiPriority="822"/>
-    <w:lsdException w:name="Light List Accent 6" w:uiPriority="823"/>
-    <w:lsdException w:name="Light Grid Accent 6" w:uiPriority="824"/>
-    <w:lsdException w:name="Medium Shading 1 Accent 6" w:uiPriority="825"/>
-    <w:lsdException w:name="Medium Shading 2 Accent 6" w:uiPriority="1432"/>
-    <w:lsdException w:name="Medium List 1 Accent 6" w:uiPriority="1433"/>
-    <w:lsdException w:name="Medium List 2 Accent 6" w:uiPriority="1536"/>
-    <w:lsdException w:name="Medium Grid 1 Accent 6" w:uiPriority="1537"/>
-    <w:lsdException w:name="Medium Grid 2 Accent 6" w:uiPriority="1544"/>
-    <w:lsdException w:name="Medium Grid 3 Accent 6" w:uiPriority="1545"/>
-    <w:lsdException w:name="Dark List Accent 6" w:uiPriority="1576"/>
-    <w:lsdException w:name="Colorful Shading Accent 6" w:uiPriority="1577"/>
-    <w:lsdException w:name="Colorful List Accent 6" w:uiPriority="1584"/>
-    <w:lsdException w:name="Colorful Grid Accent 6" w:uiPriority="1585"/>
-    <w:lsdException w:name="Subtle Emphasis" w:uiPriority="85" w:qFormat="1"/>
-    <w:lsdException w:name="Intense Emphasis" w:uiPriority="129" w:qFormat="1"/>
-    <w:lsdException w:name="Subtle Reference" w:uiPriority="277" w:qFormat="1"/>
-    <w:lsdException w:name="Intense Reference" w:uiPriority="296" w:qFormat="1"/>
-    <w:lsdException w:name="Book Title" w:uiPriority="297" w:qFormat="1"/>
-    <w:lsdException w:name="Bibliography" w:semiHidden="1" w:uiPriority="307" w:unhideWhenUsed="1"/>
-    <w:lsdException w:name="TOC Heading" w:semiHidden="1" w:uiPriority="309" w:unhideWhenUsed="1" w:qFormat="1"/>
-    <w:lsdException w:name="Plain Table 1" w:uiPriority="599"/>
-    <w:lsdException w:name="Plain Table 2" w:uiPriority="600"/>
-    <w:lsdException w:name="Plain Table 3" w:uiPriority="601"/>
-    <w:lsdException w:name="Plain Table 4" w:uiPriority="608"/>
-    <w:lsdException w:name="Plain Table 5" w:uiPriority="609"/>
-    <w:lsdException w:name="Grid Table Light" w:uiPriority="598"/>
-    <w:lsdException w:name="Grid Table 1 Light" w:uiPriority="628"/>
-    <w:lsdException w:name="Grid Table 2" w:uiPriority="629"/>
-    <w:lsdException w:name="Grid Table 3" w:uiPriority="630"/>
-    <w:lsdException w:name="Grid Table 4" w:uiPriority="631"/>
-    <w:lsdException w:name="Grid Table 5 Dark" w:uiPriority="662"/>
-    <w:lsdException w:name="Grid Table 6 Colorful" w:uiPriority="663"/>
-    <w:lsdException w:name="Grid Table 7 Colorful" w:uiPriority="772"/>
-    <w:lsdException w:name="Grid Table 1 Light Accent 1" w:uiPriority="628"/>
-    <w:lsdException w:name="Grid Table 2 Accent 1" w:uiPriority="629"/>
-    <w:lsdException w:name="Grid Table 3 Accent 1" w:uiPriority="630"/>
-    <w:lsdException w:name="Grid Table 4 Accent 1" w:uiPriority="631"/>
-    <w:lsdException w:name="Grid Table 5 Dark Accent 1" w:uiPriority="662"/>
-    <w:lsdException w:name="Grid Table 6 Colorful Accent 1" w:uiPriority="663"/>
-    <w:lsdException w:name="Grid Table 7 Colorful Accent 1" w:uiPriority="772"/>
-    <w:lsdException w:name="Grid Table 1 Light Accent 2" w:uiPriority="628"/>
-    <w:lsdException w:name="Grid Table 2 Accent 2" w:uiPriority="629"/>
-    <w:lsdException w:name="Grid Table 3 Accent 2" w:uiPriority="630"/>
-    <w:lsdException w:name="Grid Table 4 Accent 2" w:uiPriority="631"/>
-    <w:lsdException w:name="Grid Table 5 Dark Accent 2" w:uiPriority="662"/>
-    <w:lsdException w:name="Grid Table 6 Colorful Accent 2" w:uiPriority="663"/>
-    <w:lsdException w:name="Grid Table 7 Colorful Accent 2" w:uiPriority="772"/>
-    <w:lsdException w:name="Grid Table 1 Light Accent 3" w:uiPriority="628"/>
-    <w:lsdException w:name="Grid Table 2 Accent 3" w:uiPriority="629"/>
-    <w:lsdException w:name="Grid Table 3 Accent 3" w:uiPriority="630"/>
-    <w:lsdException w:name="Grid Table 4 Accent 3" w:uiPriority="631"/>
-    <w:lsdException w:name="Grid Table 5 Dark Accent 3" w:uiPriority="662"/>
-    <w:lsdException w:name="Grid Table 6 Colorful Accent 3" w:uiPriority="663"/>
-    <w:lsdException w:name="Grid Table 7 Colorful Accent 3" w:uiPriority="772"/>
-    <w:lsdException w:name="Grid Table 1 Light Accent 4" w:uiPriority="628"/>
-    <w:lsdException w:name="Grid Table 2 Accent 4" w:uiPriority="629"/>
-    <w:lsdException w:name="Grid Table 3 Accent 4" w:uiPriority="630"/>
-    <w:lsdException w:name="Grid Table 4 Accent 4" w:uiPriority="631"/>
-    <w:lsdException w:name="Grid Table 5 Dark Accent 4" w:uiPriority="662"/>
-    <w:lsdException w:name="Grid Table 6 Colorful Accent 4" w:uiPriority="663"/>
-    <w:lsdException w:name="Grid Table 7 Colorful Accent 4" w:uiPriority="772"/>
-    <w:lsdException w:name="Grid Table 1 Light Accent 5" w:uiPriority="628"/>
-    <w:lsdException w:name="Grid Table 2 Accent 5" w:uiPriority="629"/>
-    <w:lsdException w:name="Grid Table 3 Accent 5" w:uiPriority="630"/>
-    <w:lsdException w:name="Grid Table 4 Accent 5" w:uiPriority="631"/>
-    <w:lsdException w:name="Grid Table 5 Dark Accent 5" w:uiPriority="662"/>
-    <w:lsdException w:name="Grid Table 6 Colorful Accent 5" w:uiPriority="663"/>
-    <w:lsdException w:name="Grid Table 7 Colorful Accent 5" w:uiPriority="772"/>
-    <w:lsdException w:name="Grid Table 1 Light Accent 6" w:uiPriority="628"/>
-    <w:lsdException w:name="Grid Table 2 Accent 6" w:uiPriority="629"/>
-    <w:lsdException w:name="Grid Table 3 Accent 6" w:uiPriority="630"/>
-    <w:lsdException w:name="Grid Table 4 Accent 6" w:uiPriority="631"/>
-    <w:lsdException w:name="Grid Table 5 Dark Accent 6" w:uiPriority="662"/>
-    <w:lsdException w:name="Grid Table 6 Colorful Accent 6" w:uiPriority="663"/>
-    <w:lsdException w:name="Grid Table 7 Colorful Accent 6" w:uiPriority="772"/>
-    <w:lsdException w:name="List Table 1 Light" w:uiPriority="628"/>
-    <w:lsdException w:name="List Table 2" w:uiPriority="629"/>
-    <w:lsdException w:name="List Table 3" w:uiPriority="630"/>
-    <w:lsdException w:name="List Table 4" w:uiPriority="631"/>
-    <w:lsdException w:name="List Table 5 Dark" w:uiPriority="662"/>
-    <w:lsdException w:name="List Table 6 Colorful" w:uiPriority="663"/>
-    <w:lsdException w:name="List Table 7 Colorful" w:uiPriority="772"/>
-    <w:lsdException w:name="List Table 1 Light Accent 1" w:uiPriority="628"/>
-    <w:lsdException w:name="List Table 2 Accent 1" w:uiPriority="629"/>
-    <w:lsdException w:name="List Table 3 Accent 1" w:uiPriority="630"/>
-    <w:lsdException w:name="List Table 4 Accent 1" w:uiPriority="631"/>
-    <w:lsdException w:name="List Table 5 Dark Accent 1" w:uiPriority="662"/>
-    <w:lsdException w:name="List Table 6 Colorful Accent 1" w:uiPriority="663"/>
-    <w:lsdException w:name="List Table 7 Colorful Accent 1" w:uiPriority="772"/>
-    <w:lsdException w:name="List Table 1 Light Accent 2" w:uiPriority="628"/>
-    <w:lsdException w:name="List Table 2 Accent 2" w:uiPriority="629"/>
-    <w:lsdException w:name="List Table 3 Accent 2" w:uiPriority="630"/>
-    <w:lsdException w:name="List Table 4 Accent 2" w:uiPriority="631"/>
-    <w:lsdException w:name="List Table 5 Dark Accent 2" w:uiPriority="662"/>
-    <w:lsdException w:name="List Table 6 Colorful Accent 2" w:uiPriority="663"/>
-    <w:lsdException w:name="List Table 7 Colorful Accent 2" w:uiPriority="772"/>
-    <w:lsdException w:name="List Table 1 Light Accent 3" w:uiPriority="628"/>
-    <w:lsdException w:name="List Table 2 Accent 3" w:uiPriority="629"/>
-    <w:lsdException w:name="List Table 3 Accent 3" w:uiPriority="630"/>
-    <w:lsdException w:name="List Table 4 Accent 3" w:uiPriority="631"/>
-    <w:lsdException w:name="List Table 5 Dark Accent 3" w:uiPriority="662"/>
-    <w:lsdException w:name="List Table 6 Colorful Accent 3" w:uiPriority="663"/>
-    <w:lsdException w:name="List Table 7 Colorful Accent 3" w:uiPriority="772"/>
-    <w:lsdException w:name="List Table 1 Light Accent 4" w:uiPriority="628"/>
-    <w:lsdException w:name="List Table 2 Accent 4" w:uiPriority="629"/>
-    <w:lsdException w:name="List Table 3 Accent 4" w:uiPriority="630"/>
-    <w:lsdException w:name="List Table 4 Accent 4" w:uiPriority="631"/>
-    <w:lsdException w:name="List Table 5 Dark Accent 4" w:uiPriority="662"/>
-    <w:lsdException w:name="List Table 6 Colorful Accent 4" w:uiPriority="663"/>
-    <w:lsdException w:name="List Table 7 Colorful Accent 4" w:uiPriority="772"/>
-    <w:lsdException w:name="List Table 1 Light Accent 5" w:uiPriority="628"/>
-    <w:lsdException w:name="List Table 2 Accent 5" w:uiPriority="629"/>
-    <w:lsdException w:name="List Table 3 Accent 5" w:uiPriority="630"/>
-    <w:lsdException w:name="List Table 4 Accent 5" w:uiPriority="631"/>
-    <w:lsdException w:name="List Table 5 Dark Accent 5" w:uiPriority="662"/>
-    <w:lsdException w:name="List Table 6 Colorful Accent 5" w:uiPriority="663"/>
-    <w:lsdException w:name="List Table 7 Colorful Accent 5" w:uiPriority="772"/>
-    <w:lsdException w:name="List Table 1 Light Accent 6" w:uiPriority="628"/>
-    <w:lsdException w:name="List Table 2 Accent 6" w:uiPriority="629"/>
-    <w:lsdException w:name="List Table 3 Accent 6" w:uiPriority="630"/>
-    <w:lsdException w:name="List Table 4 Accent 6" w:uiPriority="631"/>
-    <w:lsdException w:name="List Table 5 Dark Accent 6" w:uiPriority="662"/>
-    <w:lsdException w:name="List Table 6 Colorful Accent 6" w:uiPriority="663"/>
-    <w:lsdException w:name="List Table 7 Colorful Accent 6" w:uiPriority="772"/>
+    <w:lsdException w:name="List Paragraph" w:uiPriority="772" w:qFormat="1"/>
+    <w:lsdException w:name="Quote" w:uiPriority="599" w:qFormat="1"/>
+    <w:lsdException w:name="Intense Quote" w:uiPriority="630" w:qFormat="1"/>
+    <w:lsdException w:name="Medium List 2 Accent 1" w:uiPriority="5430"/>
+    <w:lsdException w:name="Medium Grid 1 Accent 1" w:uiPriority="5431"/>
+    <w:lsdException w:name="Medium Grid 2 Accent 1" w:uiPriority="5444"/>
+    <w:lsdException w:name="Medium Grid 3 Accent 1" w:uiPriority="5445"/>
+    <w:lsdException w:name="Dark List Accent 1" w:uiPriority="5494"/>
+    <w:lsdException w:name="Colorful Shading Accent 1" w:uiPriority="5495"/>
+    <w:lsdException w:name="Colorful List Accent 1" w:uiPriority="5508"/>
+    <w:lsdException w:name="Colorful Grid Accent 1" w:uiPriority="5509"/>
+    <w:lsdException w:name="Light Shading Accent 2" w:uiPriority="2082"/>
+    <w:lsdException w:name="Light List Accent 2" w:uiPriority="2083"/>
+    <w:lsdException w:name="Light Grid Accent 2" w:uiPriority="2084"/>
+    <w:lsdException w:name="Medium Shading 1 Accent 2" w:uiPriority="2085"/>
+    <w:lsdException w:name="Medium Shading 2 Accent 2" w:uiPriority="5170"/>
+    <w:lsdException w:name="Medium List 1 Accent 2" w:uiPriority="5171"/>
+    <w:lsdException w:name="Medium List 2 Accent 2" w:uiPriority="5430"/>
+    <w:lsdException w:name="Medium Grid 1 Accent 2" w:uiPriority="5431"/>
+    <w:lsdException w:name="Medium Grid 2 Accent 2" w:uiPriority="5444"/>
+    <w:lsdException w:name="Medium Grid 3 Accent 2" w:uiPriority="5445"/>
+    <w:lsdException w:name="Dark List Accent 2" w:uiPriority="5494"/>
+    <w:lsdException w:name="Colorful Shading Accent 2" w:uiPriority="5495"/>
+    <w:lsdException w:name="Colorful List Accent 2" w:uiPriority="5508"/>
+    <w:lsdException w:name="Colorful Grid Accent 2" w:uiPriority="5509"/>
+    <w:lsdException w:name="Light Shading Accent 3" w:uiPriority="2082"/>
+    <w:lsdException w:name="Light List Accent 3" w:uiPriority="2083"/>
+    <w:lsdException w:name="Light Grid Accent 3" w:uiPriority="2084"/>
+    <w:lsdException w:name="Medium Shading 1 Accent 3" w:uiPriority="2085"/>
+    <w:lsdException w:name="Medium Shading 2 Accent 3" w:uiPriority="5170"/>
+    <w:lsdException w:name="Medium List 1 Accent 3" w:uiPriority="5171"/>
+    <w:lsdException w:name="Medium List 2 Accent 3" w:uiPriority="5430"/>
+    <w:lsdException w:name="Medium Grid 1 Accent 3" w:uiPriority="5431"/>
+    <w:lsdException w:name="Medium Grid 2 Accent 3" w:uiPriority="5444"/>
+    <w:lsdException w:name="Medium Grid 3 Accent 3" w:uiPriority="5445"/>
+    <w:lsdException w:name="Dark List Accent 3" w:uiPriority="5494"/>
+    <w:lsdException w:name="Colorful Shading Accent 3" w:uiPriority="5495"/>
+    <w:lsdException w:name="Colorful List Accent 3" w:uiPriority="5508"/>
+    <w:lsdException w:name="Colorful Grid Accent 3" w:uiPriority="5509"/>
+    <w:lsdException w:name="Light Shading Accent 4" w:uiPriority="2082"/>
+    <w:lsdException w:name="Light List Accent 4" w:uiPriority="2083"/>
+    <w:lsdException w:name="Light Grid Accent 4" w:uiPriority="2084"/>
+    <w:lsdException w:name="Medium Shading 1 Accent 4" w:uiPriority="2085"/>
+    <w:lsdException w:name="Medium Shading 2 Accent 4" w:uiPriority="5170"/>
+    <w:lsdException w:name="Medium List 1 Accent 4" w:uiPriority="5171"/>
+    <w:lsdException w:name="Medium List 2 Accent 4" w:uiPriority="5430"/>
+    <w:lsdException w:name="Medium Grid 1 Accent 4" w:uiPriority="5431"/>
+    <w:lsdException w:name="Medium Grid 2 Accent 4" w:uiPriority="5444"/>
+    <w:lsdException w:name="Medium Grid 3 Accent 4" w:uiPriority="5445"/>
+    <w:lsdException w:name="Dark List Accent 4" w:uiPriority="5494"/>
+    <w:lsdException w:name="Colorful Shading Accent 4" w:uiPriority="5495"/>
+    <w:lsdException w:name="Colorful List Accent 4" w:uiPriority="5508"/>
+    <w:lsdException w:name="Colorful Grid Accent 4" w:uiPriority="5509"/>
+    <w:lsdException w:name="Light Shading Accent 5" w:uiPriority="2082"/>
+    <w:lsdException w:name="Light List Accent 5" w:uiPriority="2083"/>
+    <w:lsdException w:name="Light Grid Accent 5" w:uiPriority="2084"/>
+    <w:lsdException w:name="Medium Shading 1 Accent 5" w:uiPriority="2085"/>
+    <w:lsdException w:name="Medium Shading 2 Accent 5" w:uiPriority="5170"/>
+    <w:lsdException w:name="Medium List 1 Accent 5" w:uiPriority="5171"/>
+    <w:lsdException w:name="Medium List 2 Accent 5" w:uiPriority="5430"/>
+    <w:lsdException w:name="Medium Grid 1 Accent 5" w:uiPriority="5431"/>
+    <w:lsdException w:name="Medium Grid 2 Accent 5" w:uiPriority="5444"/>
+    <w:lsdException w:name="Medium Grid 3 Accent 5" w:uiPriority="5445"/>
+    <w:lsdException w:name="Dark List Accent 5" w:uiPriority="5494"/>
+    <w:lsdException w:name="Colorful Shading Accent 5" w:uiPriority="5495"/>
+    <w:lsdException w:name="Colorful List Accent 5" w:uiPriority="5508"/>
+    <w:lsdException w:name="Colorful Grid Accent 5" w:uiPriority="5509"/>
+    <w:lsdException w:name="Light Shading Accent 6" w:uiPriority="2082"/>
+    <w:lsdException w:name="Light List Accent 6" w:uiPriority="2083"/>
+    <w:lsdException w:name="Light Grid Accent 6" w:uiPriority="2084"/>
+    <w:lsdException w:name="Medium Shading 1 Accent 6" w:uiPriority="2085"/>
+    <w:lsdException w:name="Medium Shading 2 Accent 6" w:uiPriority="5170"/>
+    <w:lsdException w:name="Medium List 1 Accent 6" w:uiPriority="5171"/>
+    <w:lsdException w:name="Medium List 2 Accent 6" w:uiPriority="5430"/>
+    <w:lsdException w:name="Medium Grid 1 Accent 6" w:uiPriority="5431"/>
+    <w:lsdException w:name="Medium Grid 2 Accent 6" w:uiPriority="5444"/>
+    <w:lsdException w:name="Medium Grid 3 Accent 6" w:uiPriority="5445"/>
+    <w:lsdException w:name="Dark List Accent 6" w:uiPriority="5494"/>
+    <w:lsdException w:name="Colorful Shading Accent 6" w:uiPriority="5495"/>
+    <w:lsdException w:name="Colorful List Accent 6" w:uiPriority="5508"/>
+    <w:lsdException w:name="Colorful Grid Accent 6" w:uiPriority="5509"/>
+    <w:lsdException w:name="Subtle Emphasis" w:uiPriority="133" w:qFormat="1"/>
+    <w:lsdException w:name="Intense Emphasis" w:uiPriority="297" w:qFormat="1"/>
+    <w:lsdException w:name="Subtle Reference" w:uiPriority="631" w:qFormat="1"/>
+    <w:lsdException w:name="Intense Reference" w:uiPriority="662" w:qFormat="1"/>
+    <w:lsdException w:name="Book Title" w:uiPriority="663" w:qFormat="1"/>
+    <w:lsdException w:name="Bibliography" w:semiHidden="1" w:uiPriority="775" w:unhideWhenUsed="1"/>
+    <w:lsdException w:name="TOC Heading" w:semiHidden="1" w:uiPriority="777" w:unhideWhenUsed="1" w:qFormat="1"/>
+    <w:lsdException w:name="Plain Table 1" w:uiPriority="1433"/>
+    <w:lsdException w:name="Plain Table 2" w:uiPriority="1536"/>
+    <w:lsdException w:name="Plain Table 3" w:uiPriority="1537"/>
+    <w:lsdException w:name="Plain Table 4" w:uiPriority="1544"/>
+    <w:lsdException w:name="Plain Table 5" w:uiPriority="1545"/>
+    <w:lsdException w:name="Grid Table Light" w:uiPriority="1432"/>
+    <w:lsdException w:name="Grid Table 1 Light" w:uiPriority="1576"/>
+    <w:lsdException w:name="Grid Table 2" w:uiPriority="1577"/>
+    <w:lsdException w:name="Grid Table 3" w:uiPriority="1584"/>
+    <w:lsdException w:name="Grid Table 4" w:uiPriority="1585"/>
+    <w:lsdException w:name="Grid Table 5 Dark" w:uiPriority="1634"/>
+    <w:lsdException w:name="Grid Table 6 Colorful" w:uiPriority="1635"/>
+    <w:lsdException w:name="Grid Table 7 Colorful" w:uiPriority="1906"/>
+    <w:lsdException w:name="Grid Table 1 Light Accent 1" w:uiPriority="1576"/>
+    <w:lsdException w:name="Grid Table 2 Accent 1" w:uiPriority="1577"/>
+    <w:lsdException w:name="Grid Table 3 Accent 1" w:uiPriority="1584"/>
+    <w:lsdException w:name="Grid Table 4 Accent 1" w:uiPriority="1585"/>
+    <w:lsdException w:name="Grid Table 5 Dark Accent 1" w:uiPriority="1634"/>
+    <w:lsdException w:name="Grid Table 6 Colorful Accent 1" w:uiPriority="1635"/>
+    <w:lsdException w:name="Grid Table 7 Colorful Accent 1" w:uiPriority="1906"/>
+    <w:lsdException w:name="Grid Table 1 Light Accent 2" w:uiPriority="1576"/>
+    <w:lsdException w:name="Grid Table 2 Accent 2" w:uiPriority="1577"/>
+    <w:lsdException w:name="Grid Table 3 Accent 2" w:uiPriority="1584"/>
+    <w:lsdException w:name="Grid Table 4 Accent 2" w:uiPriority="1585"/>
+    <w:lsdException w:name="Grid Table 5 Dark Accent 2" w:uiPriority="1634"/>
+    <w:lsdException w:name="Grid Table 6 Colorful Accent 2" w:uiPriority="1635"/>
+    <w:lsdException w:name="Grid Table 7 Colorful Accent 2" w:uiPriority="1906"/>
+    <w:lsdException w:name="Grid Table 1 Light Accent 3" w:uiPriority="1576"/>
+    <w:lsdException w:name="Grid Table 2 Accent 3" w:uiPriority="1577"/>
+    <w:lsdException w:name="Grid Table 3 Accent 3" w:uiPriority="1584"/>
+    <w:lsdException w:name="Grid Table 4 Accent 3" w:uiPriority="1585"/>
+    <w:lsdException w:name="Grid Table 5 Dark Accent 3" w:uiPriority="1634"/>
+    <w:lsdException w:name="Grid Table 6 Colorful Accent 3" w:uiPriority="1635"/>
+    <w:lsdException w:name="Grid Table 7 Colorful Accent 3" w:uiPriority="1906"/>
+    <w:lsdException w:name="Grid Table 1 Light Accent 4" w:uiPriority="1576"/>
+    <w:lsdException w:name="Grid Table 2 Accent 4" w:uiPriority="1577"/>
+    <w:lsdException w:name="Grid Table 3 Accent 4" w:uiPriority="1584"/>
+    <w:lsdException w:name="Grid Table 4 Accent 4" w:uiPriority="1585"/>
+    <w:lsdException w:name="Grid Table 5 Dark Accent 4" w:uiPriority="1634"/>
+    <w:lsdException w:name="Grid Table 6 Colorful Accent 4" w:uiPriority="1635"/>
+    <w:lsdException w:name="Grid Table 7 Colorful Accent 4" w:uiPriority="1906"/>
+    <w:lsdException w:name="Grid Table 1 Light Accent 5" w:uiPriority="1576"/>
+    <w:lsdException w:name="Grid Table 2 Accent 5" w:uiPriority="1577"/>
+    <w:lsdException w:name="Grid Table 3 Accent 5" w:uiPriority="1584"/>
+    <w:lsdException w:name="Grid Table 4 Accent 5" w:uiPriority="1585"/>
+    <w:lsdException w:name="Grid Table 5 Dark Accent 5" w:uiPriority="1634"/>
+    <w:lsdException w:name="Grid Table 6 Colorful Accent 5" w:uiPriority="1635"/>
+    <w:lsdException w:name="Grid Table 7 Colorful Accent 5" w:uiPriority="1906"/>
+    <w:lsdException w:name="Grid Table 1 Light Accent 6" w:uiPriority="1576"/>
+    <w:lsdException w:name="Grid Table 2 Accent 6" w:uiPriority="1577"/>
+    <w:lsdException w:name="Grid Table 3 Accent 6" w:uiPriority="1584"/>
+    <w:lsdException w:name="Grid Table 4 Accent 6" w:uiPriority="1585"/>
+    <w:lsdException w:name="Grid Table 5 Dark Accent 6" w:uiPriority="1634"/>
+    <w:lsdException w:name="Grid Table 6 Colorful Accent 6" w:uiPriority="1635"/>
+    <w:lsdException w:name="Grid Table 7 Colorful Accent 6" w:uiPriority="1906"/>
+    <w:lsdException w:name="List Table 1 Light" w:uiPriority="1576"/>
+    <w:lsdException w:name="List Table 2" w:uiPriority="1577"/>
+    <w:lsdException w:name="List Table 3" w:uiPriority="1584"/>
+    <w:lsdException w:name="List Table 4" w:uiPriority="1585"/>
+    <w:lsdException w:name="List Table 5 Dark" w:uiPriority="1634"/>
+    <w:lsdException w:name="List Table 6 Colorful" w:uiPriority="1635"/>
+    <w:lsdException w:name="List Table 7 Colorful" w:uiPriority="1906"/>
+    <w:lsdException w:name="List Table 1 Light Accent 1" w:uiPriority="1576"/>
+    <w:lsdException w:name="List Table 2 Accent 1" w:uiPriority="1577"/>
+    <w:lsdException w:name="List Table 3 Accent 1" w:uiPriority="1584"/>
+    <w:lsdException w:name="List Table 4 Accent 1" w:uiPriority="1585"/>
+    <w:lsdException w:name="List Table 5 Dark Accent 1" w:uiPriority="1634"/>
+    <w:lsdException w:name="List Table 6 Colorful Accent 1" w:uiPriority="1635"/>
+    <w:lsdException w:name="List Table 7 Colorful Accent 1" w:uiPriority="1906"/>
+    <w:lsdException w:name="List Table 1 Light Accent 2" w:uiPriority="1576"/>
+    <w:lsdException w:name="List Table 2 Accent 2" w:uiPriority="1577"/>
+    <w:lsdException w:name="List Table 3 Accent 2" w:uiPriority="1584"/>
+    <w:lsdException w:name="List Table 4 Accent 2" w:uiPriority="1585"/>
+    <w:lsdException w:name="List Table 5 Dark Accent 2" w:uiPriority="1634"/>
+    <w:lsdException w:name="List Table 6 Colorful Accent 2" w:uiPriority="1635"/>
+    <w:lsdException w:name="List Table 7 Colorful Accent 2" w:uiPriority="1906"/>
+    <w:lsdException w:name="List Table 1 Light Accent 3" w:uiPriority="1576"/>
+    <w:lsdException w:name="List Table 2 Accent 3" w:uiPriority="1577"/>
+    <w:lsdException w:name="List Table 3 Accent 3" w:uiPriority="1584"/>
+    <w:lsdException w:name="List Table 4 Accent 3" w:uiPriority="1585"/>
+    <w:lsdException w:name="List Table 5 Dark Accent 3" w:uiPriority="1634"/>
+    <w:lsdException w:name="List Table 6 Colorful Accent 3" w:uiPriority="1635"/>
+    <w:lsdException w:name="List Table 7 Colorful Accent 3" w:uiPriority="1906"/>
+    <w:lsdException w:name="List Table 1 Light Accent 4" w:uiPriority="1576"/>
+    <w:lsdException w:name="List Table 2 Accent 4" w:uiPriority="1577"/>
+    <w:lsdException w:name="List Table 3 Accent 4" w:uiPriority="1584"/>
+    <w:lsdException w:name="List Table 4 Accent 4" w:uiPriority="1585"/>
+    <w:lsdException w:name="List Table 5 Dark Accent 4" w:uiPriority="1634"/>
+    <w:lsdException w:name="List Table 6 Colorful Accent 4" w:uiPriority="1635"/>
+    <w:lsdException w:name="List Table 7 Colorful Accent 4" w:uiPriority="1906"/>
+    <w:lsdException w:name="List Table 1 Light Accent 5" w:uiPriority="1576"/>
+    <w:lsdException w:name="List Table 2 Accent 5" w:uiPriority="1577"/>
+    <w:lsdException w:name="List Table 3 Accent 5" w:uiPriority="1584"/>
+    <w:lsdException w:name="List Table 4 Accent 5" w:uiPriority="1585"/>
+    <w:lsdException w:name="List Table 5 Dark Accent 5" w:uiPriority="1634"/>
+    <w:lsdException w:name="List Table 6 Colorful Accent 5" w:uiPriority="1635"/>
+    <w:lsdException w:name="List Table 7 Colorful Accent 5" w:uiPriority="1906"/>
+    <w:lsdException w:name="List Table 1 Light Accent 6" w:uiPriority="1576"/>
+    <w:lsdException w:name="List Table 2 Accent 6" w:uiPriority="1577"/>
+    <w:lsdException w:name="List Table 3 Accent 6" w:uiPriority="1584"/>
+    <w:lsdException w:name="List Table 4 Accent 6" w:uiPriority="1585"/>
+    <w:lsdException w:name="List Table 5 Dark Accent 6" w:uiPriority="1634"/>
+    <w:lsdException w:name="List Table 6 Colorful Accent 6" w:uiPriority="1635"/>
+    <w:lsdException w:name="List Table 7 Colorful Accent 6" w:uiPriority="1906"/>
   </w:latentStyles>
   <w:style w:type="paragraph" w:default="1" w:styleId="a">
     <w:name w:val="Normal"/>
@@ -9700,6 +10946,16 @@
     <w:pPr>
       <w:ind w:left="851"/>
     </w:pPr>
+  </w:style>
+  <w:style w:type="character" w:styleId="afffffe">
+    <w:name w:val="Hyperlink"/>
+    <w:uiPriority w:val="99"/>
+    <w:basedOn w:val="a0"/>
+    <w:unhideWhenUsed/>
+    <w:rPr>
+      <w:color w:val="0000FF"/>
+      <w:u w:val="single" w:color="auto"/>
+    </w:rPr>
   </w:style>
 </w:styles>
 </file>

</xml_diff>